<commit_message>
fix: Update shareholder report Word+PPT with SmartMove rename
- generate-report.js: 3Way Sensor → SmartMove
- generate-ppt.js: 3Way Sensor → SmartMove
- Regenerated both .docx and .pptx files

Co-Authored-By: Claude Opus 4.6 (1M context) <noreply@anthropic.com>
</commit_message>
<xml_diff>
--- a/docs/shareholder/WB_App_Renewal_Shareholder_Report_2026.docx
+++ b/docs/shareholder/WB_App_Renewal_Shareholder_Report_2026.docx
@@ -2785,7 +2785,7 @@
           <w:sz w:val="22"/>
           <w:szCs w:val="22"/>
         </w:rPr>
-        <w:t xml:space="preserve">3Way Sensor(탄소저감) → 멀티스포츠 챌린지 → 커머스 → STO 순서로 확장하여, 각 단계가 다음 단계의 기반이 됩니다.</w:t>
+        <w:t xml:space="preserve">SmartMove(탄소저감) → 멀티스포츠 챌린지 → 커머스 → STO 순서로 확장하여, 각 단계가 다음 단계의 기반이 됩니다.</w:t>
       </w:r>
     </w:p>
     <w:p>
@@ -2970,7 +2970,7 @@
                 <w:sz w:val="20"/>
                 <w:szCs w:val="20"/>
               </w:rPr>
-              <w:t xml:space="preserve">1. 3Way Sensor</w:t>
+              <w:t xml:space="preserve">1. SmartMove</w:t>
             </w:r>
           </w:p>
         </w:tc>
@@ -3512,7 +3512,7 @@
           <w:sz w:val="36"/>
           <w:szCs w:val="36"/>
         </w:rPr>
-        <w:t xml:space="preserve">4. Phase 1 상세: 3Way Sensor + 탄소저감</w:t>
+        <w:t xml:space="preserve">4. Phase 1 상세: SmartMove + 탄소저감</w:t>
       </w:r>
     </w:p>
     <w:p>
@@ -3739,7 +3739,7 @@
                 <w:sz w:val="20"/>
                 <w:szCs w:val="20"/>
               </w:rPr>
-              <w:t xml:space="preserve">3Way Sensor (Platform API)</w:t>
+              <w:t xml:space="preserve">SmartMove (Platform API)</w:t>
             </w:r>
           </w:p>
         </w:tc>
@@ -3837,7 +3837,7 @@
                 <w:sz w:val="20"/>
                 <w:szCs w:val="20"/>
               </w:rPr>
-              <w:t xml:space="preserve">3Way Sensor (Platform API)</w:t>
+              <w:t xml:space="preserve">SmartMove (Platform API)</w:t>
             </w:r>
           </w:p>
         </w:tc>
@@ -3935,7 +3935,7 @@
                 <w:sz w:val="20"/>
                 <w:szCs w:val="20"/>
               </w:rPr>
-              <w:t xml:space="preserve">3Way Sensor + GPS 속도</w:t>
+              <w:t xml:space="preserve">SmartMove + GPS 속도</w:t>
             </w:r>
           </w:p>
         </w:tc>
@@ -8991,7 +8991,7 @@
           <w:sz w:val="22"/>
           <w:szCs w:val="22"/>
         </w:rPr>
-        <w:t xml:space="preserve">현재 MAU ~4,000, 전 지표 하락 중인 상황에서 앱 리뉴얼은 선택이 아닌 필수입니다. 3Way Sensor + SSP + 광고 수익 모델로 Phase 1부터 흑자 구조를 만들고, 4단계 성장 전략으로 STO(토큰증권)까지 확장합니다.</w:t>
+        <w:t xml:space="preserve">현재 MAU ~4,000, 전 지표 하락 중인 상황에서 앱 리뉴얼은 선택이 아닌 필수입니다. SmartMove + SSP + 광고 수익 모델로 Phase 1부터 흑자 구조를 만들고, 4단계 성장 전략으로 STO(토큰증권)까지 확장합니다.</w:t>
       </w:r>
     </w:p>
     <w:p>

</xml_diff>

<commit_message>
docs: Add AI Dev Team section to shareholder report (Word + PPT)
New Section 8: AI 개발팀 구축 효과
- 6 AI teams + 16 QA agents composition table
- Cost savings: 월 3,200만원 → ~20만원 (99.4%, 연 3.6억 절감)
- Speed: 38w → 25.5w (33% faster), QA 75% faster
- Role change: developer → decision maker
- Word: 10 sections (was 9)
- PPT: 11 slides (was 10), new slide with callout cards

Co-Authored-By: Claude Opus 4.6 (1M context) <noreply@anthropic.com>
</commit_message>
<xml_diff>
--- a/docs/shareholder/WB_App_Renewal_Shareholder_Report_2026.docx
+++ b/docs/shareholder/WB_App_Renewal_Shareholder_Report_2026.docx
@@ -8327,7 +8327,3532 @@
           <w:sz w:val="36"/>
           <w:szCs w:val="36"/>
         </w:rPr>
-        <w:t xml:space="preserve">8. 추진 일정</w:t>
+        <w:t xml:space="preserve">8. AI 개발팀 구축 효과</w:t>
+      </w:r>
+    </w:p>
+    <w:p>
+      <w:pPr>
+        <w:shd w:fill="D5E8F0" w:val="clear"/>
+        <w:spacing w:after="200" w:before="200"/>
+        <w:ind w:left="360" w:right="360"/>
+      </w:pPr>
+      <w:r>
+        <w:rPr>
+          <w:rFonts w:ascii="Arial" w:cs="Arial" w:eastAsia="Arial" w:hAnsi="Arial"/>
+          <w:b/>
+          <w:bCs/>
+          <w:color w:val="003366"/>
+          <w:sz w:val="22"/>
+          <w:szCs w:val="22"/>
+        </w:rPr>
+        <w:t xml:space="preserve">KEY MESSAGE: </w:t>
+      </w:r>
+      <w:r>
+        <w:rPr>
+          <w:rFonts w:ascii="Arial" w:cs="Arial" w:eastAsia="Arial" w:hAnsi="Arial"/>
+          <w:color w:val="333333"/>
+          <w:sz w:val="22"/>
+          <w:szCs w:val="22"/>
+        </w:rPr>
+        <w:t xml:space="preserve">6개 AI 팀 + 16개 QA 에이전트로 구성된 자동화 개발 파이프라인을 구축하여, 3~4명 규모의 개발팀과 동등한 생산성을 1인 체제에서 달성합니다.</w:t>
+      </w:r>
+    </w:p>
+    <w:p>
+      <w:pPr>
+        <w:spacing w:after="100" w:before="100"/>
+      </w:pPr>
+    </w:p>
+    <w:p>
+      <w:pPr>
+        <w:spacing w:after="100" w:before="200"/>
+      </w:pPr>
+      <w:r>
+        <w:rPr>
+          <w:rFonts w:ascii="Arial" w:cs="Arial" w:eastAsia="Arial" w:hAnsi="Arial"/>
+          <w:b/>
+          <w:bCs/>
+          <w:color w:val="0066CC"/>
+          <w:sz w:val="24"/>
+          <w:szCs w:val="24"/>
+        </w:rPr>
+        <w:t xml:space="preserve">AI 개발팀 구성 (Dev Pipeline)</w:t>
+      </w:r>
+    </w:p>
+    <w:tbl>
+      <w:tblPr>
+        <w:tblW w:type="dxa" w:w="9360"/>
+        <w:tblBorders>
+          <w:top w:val="single" w:color="auto" w:sz="4"/>
+          <w:left w:val="single" w:color="auto" w:sz="4"/>
+          <w:bottom w:val="single" w:color="auto" w:sz="4"/>
+          <w:right w:val="single" w:color="auto" w:sz="4"/>
+          <w:insideH w:val="single" w:color="auto" w:sz="4"/>
+          <w:insideV w:val="single" w:color="auto" w:sz="4"/>
+        </w:tblBorders>
+      </w:tblPr>
+      <w:tblGrid>
+        <w:gridCol w:w="2340"/>
+        <w:gridCol w:w="2340"/>
+        <w:gridCol w:w="2340"/>
+        <w:gridCol w:w="2340"/>
+      </w:tblGrid>
+      <w:tr>
+        <w:tc>
+          <w:tcPr>
+            <w:tcW w:type="dxa" w:w="2340"/>
+            <w:tcBorders>
+              <w:top w:val="single" w:color="CCCCCC" w:sz="1"/>
+              <w:left w:val="single" w:color="CCCCCC" w:sz="1"/>
+              <w:bottom w:val="single" w:color="CCCCCC" w:sz="1"/>
+              <w:right w:val="single" w:color="CCCCCC" w:sz="1"/>
+            </w:tcBorders>
+            <w:shd w:fill="003366" w:val="clear"/>
+            <w:tcMar>
+              <w:top w:type="dxa" w:w="80"/>
+              <w:left w:type="dxa" w:w="120"/>
+              <w:bottom w:type="dxa" w:w="80"/>
+              <w:right w:type="dxa" w:w="120"/>
+            </w:tcMar>
+            <w:vAlign w:val="center"/>
+          </w:tcPr>
+          <w:p>
+            <w:r>
+              <w:rPr>
+                <w:rFonts w:ascii="Arial" w:cs="Arial" w:eastAsia="Arial" w:hAnsi="Arial"/>
+                <w:b/>
+                <w:bCs/>
+                <w:color w:val="FFFFFF"/>
+                <w:sz w:val="20"/>
+                <w:szCs w:val="20"/>
+              </w:rPr>
+              <w:t xml:space="preserve">팀</w:t>
+            </w:r>
+          </w:p>
+        </w:tc>
+        <w:tc>
+          <w:tcPr>
+            <w:tcW w:type="dxa" w:w="2340"/>
+            <w:tcBorders>
+              <w:top w:val="single" w:color="CCCCCC" w:sz="1"/>
+              <w:left w:val="single" w:color="CCCCCC" w:sz="1"/>
+              <w:bottom w:val="single" w:color="CCCCCC" w:sz="1"/>
+              <w:right w:val="single" w:color="CCCCCC" w:sz="1"/>
+            </w:tcBorders>
+            <w:shd w:fill="003366" w:val="clear"/>
+            <w:tcMar>
+              <w:top w:type="dxa" w:w="80"/>
+              <w:left w:type="dxa" w:w="120"/>
+              <w:bottom w:type="dxa" w:w="80"/>
+              <w:right w:type="dxa" w:w="120"/>
+            </w:tcMar>
+            <w:vAlign w:val="center"/>
+          </w:tcPr>
+          <w:p>
+            <w:r>
+              <w:rPr>
+                <w:rFonts w:ascii="Arial" w:cs="Arial" w:eastAsia="Arial" w:hAnsi="Arial"/>
+                <w:b/>
+                <w:bCs/>
+                <w:color w:val="FFFFFF"/>
+                <w:sz w:val="20"/>
+                <w:szCs w:val="20"/>
+              </w:rPr>
+              <w:t xml:space="preserve">역할</w:t>
+            </w:r>
+          </w:p>
+        </w:tc>
+        <w:tc>
+          <w:tcPr>
+            <w:tcW w:type="dxa" w:w="2340"/>
+            <w:tcBorders>
+              <w:top w:val="single" w:color="CCCCCC" w:sz="1"/>
+              <w:left w:val="single" w:color="CCCCCC" w:sz="1"/>
+              <w:bottom w:val="single" w:color="CCCCCC" w:sz="1"/>
+              <w:right w:val="single" w:color="CCCCCC" w:sz="1"/>
+            </w:tcBorders>
+            <w:shd w:fill="003366" w:val="clear"/>
+            <w:tcMar>
+              <w:top w:type="dxa" w:w="80"/>
+              <w:left w:type="dxa" w:w="120"/>
+              <w:bottom w:type="dxa" w:w="80"/>
+              <w:right w:type="dxa" w:w="120"/>
+            </w:tcMar>
+            <w:vAlign w:val="center"/>
+          </w:tcPr>
+          <w:p>
+            <w:r>
+              <w:rPr>
+                <w:rFonts w:ascii="Arial" w:cs="Arial" w:eastAsia="Arial" w:hAnsi="Arial"/>
+                <w:b/>
+                <w:bCs/>
+                <w:color w:val="FFFFFF"/>
+                <w:sz w:val="20"/>
+                <w:szCs w:val="20"/>
+              </w:rPr>
+              <w:t xml:space="preserve">에이전트 수</w:t>
+            </w:r>
+          </w:p>
+        </w:tc>
+        <w:tc>
+          <w:tcPr>
+            <w:tcW w:type="dxa" w:w="2340"/>
+            <w:tcBorders>
+              <w:top w:val="single" w:color="CCCCCC" w:sz="1"/>
+              <w:left w:val="single" w:color="CCCCCC" w:sz="1"/>
+              <w:bottom w:val="single" w:color="CCCCCC" w:sz="1"/>
+              <w:right w:val="single" w:color="CCCCCC" w:sz="1"/>
+            </w:tcBorders>
+            <w:shd w:fill="003366" w:val="clear"/>
+            <w:tcMar>
+              <w:top w:type="dxa" w:w="80"/>
+              <w:left w:type="dxa" w:w="120"/>
+              <w:bottom w:type="dxa" w:w="80"/>
+              <w:right w:type="dxa" w:w="120"/>
+            </w:tcMar>
+            <w:vAlign w:val="center"/>
+          </w:tcPr>
+          <w:p>
+            <w:r>
+              <w:rPr>
+                <w:rFonts w:ascii="Arial" w:cs="Arial" w:eastAsia="Arial" w:hAnsi="Arial"/>
+                <w:b/>
+                <w:bCs/>
+                <w:color w:val="FFFFFF"/>
+                <w:sz w:val="20"/>
+                <w:szCs w:val="20"/>
+              </w:rPr>
+              <w:t xml:space="preserve">인건비 대체 효과</w:t>
+            </w:r>
+          </w:p>
+        </w:tc>
+      </w:tr>
+      <w:tr>
+        <w:tc>
+          <w:tcPr>
+            <w:tcW w:type="dxa" w:w="2340"/>
+            <w:tcBorders>
+              <w:top w:val="single" w:color="CCCCCC" w:sz="1"/>
+              <w:left w:val="single" w:color="CCCCCC" w:sz="1"/>
+              <w:bottom w:val="single" w:color="CCCCCC" w:sz="1"/>
+              <w:right w:val="single" w:color="CCCCCC" w:sz="1"/>
+            </w:tcBorders>
+            <w:shd w:fill="F5F5F5" w:val="clear"/>
+            <w:tcMar>
+              <w:top w:type="dxa" w:w="80"/>
+              <w:left w:type="dxa" w:w="120"/>
+              <w:bottom w:type="dxa" w:w="80"/>
+              <w:right w:type="dxa" w:w="120"/>
+            </w:tcMar>
+            <w:vAlign w:val="center"/>
+          </w:tcPr>
+          <w:p>
+            <w:r>
+              <w:rPr>
+                <w:rFonts w:ascii="Arial" w:cs="Arial" w:eastAsia="Arial" w:hAnsi="Arial"/>
+                <w:b/>
+                <w:bCs/>
+                <w:color w:val="333333"/>
+                <w:sz w:val="20"/>
+                <w:szCs w:val="20"/>
+              </w:rPr>
+              <w:t xml:space="preserve">T1 일정기획</w:t>
+            </w:r>
+          </w:p>
+        </w:tc>
+        <w:tc>
+          <w:tcPr>
+            <w:tcW w:type="dxa" w:w="2340"/>
+            <w:tcBorders>
+              <w:top w:val="single" w:color="CCCCCC" w:sz="1"/>
+              <w:left w:val="single" w:color="CCCCCC" w:sz="1"/>
+              <w:bottom w:val="single" w:color="CCCCCC" w:sz="1"/>
+              <w:right w:val="single" w:color="CCCCCC" w:sz="1"/>
+            </w:tcBorders>
+            <w:shd w:fill="FFFFFF" w:val="clear"/>
+            <w:tcMar>
+              <w:top w:type="dxa" w:w="80"/>
+              <w:left w:type="dxa" w:w="120"/>
+              <w:bottom w:type="dxa" w:w="80"/>
+              <w:right w:type="dxa" w:w="120"/>
+            </w:tcMar>
+            <w:vAlign w:val="center"/>
+          </w:tcPr>
+          <w:p>
+            <w:r>
+              <w:rPr>
+                <w:rFonts w:ascii="Arial" w:cs="Arial" w:eastAsia="Arial" w:hAnsi="Arial"/>
+                <w:b w:val="false"/>
+                <w:bCs w:val="false"/>
+                <w:color w:val="333333"/>
+                <w:sz w:val="20"/>
+                <w:szCs w:val="20"/>
+              </w:rPr>
+              <w:t xml:space="preserve">스프린트 분해 + 일정 분석</w:t>
+            </w:r>
+          </w:p>
+        </w:tc>
+        <w:tc>
+          <w:tcPr>
+            <w:tcW w:type="dxa" w:w="2340"/>
+            <w:tcBorders>
+              <w:top w:val="single" w:color="CCCCCC" w:sz="1"/>
+              <w:left w:val="single" w:color="CCCCCC" w:sz="1"/>
+              <w:bottom w:val="single" w:color="CCCCCC" w:sz="1"/>
+              <w:right w:val="single" w:color="CCCCCC" w:sz="1"/>
+            </w:tcBorders>
+            <w:shd w:fill="FFFFFF" w:val="clear"/>
+            <w:tcMar>
+              <w:top w:type="dxa" w:w="80"/>
+              <w:left w:type="dxa" w:w="120"/>
+              <w:bottom w:type="dxa" w:w="80"/>
+              <w:right w:type="dxa" w:w="120"/>
+            </w:tcMar>
+            <w:vAlign w:val="center"/>
+          </w:tcPr>
+          <w:p>
+            <w:r>
+              <w:rPr>
+                <w:rFonts w:ascii="Arial" w:cs="Arial" w:eastAsia="Arial" w:hAnsi="Arial"/>
+                <w:b w:val="false"/>
+                <w:bCs w:val="false"/>
+                <w:color w:val="333333"/>
+                <w:sz w:val="20"/>
+                <w:szCs w:val="20"/>
+              </w:rPr>
+              <w:t xml:space="preserve">2개</w:t>
+            </w:r>
+          </w:p>
+        </w:tc>
+        <w:tc>
+          <w:tcPr>
+            <w:tcW w:type="dxa" w:w="2340"/>
+            <w:tcBorders>
+              <w:top w:val="single" w:color="CCCCCC" w:sz="1"/>
+              <w:left w:val="single" w:color="CCCCCC" w:sz="1"/>
+              <w:bottom w:val="single" w:color="CCCCCC" w:sz="1"/>
+              <w:right w:val="single" w:color="CCCCCC" w:sz="1"/>
+            </w:tcBorders>
+            <w:shd w:fill="FFFFFF" w:val="clear"/>
+            <w:tcMar>
+              <w:top w:type="dxa" w:w="80"/>
+              <w:left w:type="dxa" w:w="120"/>
+              <w:bottom w:type="dxa" w:w="80"/>
+              <w:right w:type="dxa" w:w="120"/>
+            </w:tcMar>
+            <w:vAlign w:val="center"/>
+          </w:tcPr>
+          <w:p>
+            <w:r>
+              <w:rPr>
+                <w:rFonts w:ascii="Arial" w:cs="Arial" w:eastAsia="Arial" w:hAnsi="Arial"/>
+                <w:b w:val="false"/>
+                <w:bCs w:val="false"/>
+                <w:color w:val="333333"/>
+                <w:sz w:val="20"/>
+                <w:szCs w:val="20"/>
+              </w:rPr>
+              <w:t xml:space="preserve">PM 1명 (월 500만원)</w:t>
+            </w:r>
+          </w:p>
+        </w:tc>
+      </w:tr>
+      <w:tr>
+        <w:tc>
+          <w:tcPr>
+            <w:tcW w:type="dxa" w:w="2340"/>
+            <w:tcBorders>
+              <w:top w:val="single" w:color="CCCCCC" w:sz="1"/>
+              <w:left w:val="single" w:color="CCCCCC" w:sz="1"/>
+              <w:bottom w:val="single" w:color="CCCCCC" w:sz="1"/>
+              <w:right w:val="single" w:color="CCCCCC" w:sz="1"/>
+            </w:tcBorders>
+            <w:shd w:fill="F5F5F5" w:val="clear"/>
+            <w:tcMar>
+              <w:top w:type="dxa" w:w="80"/>
+              <w:left w:type="dxa" w:w="120"/>
+              <w:bottom w:type="dxa" w:w="80"/>
+              <w:right w:type="dxa" w:w="120"/>
+            </w:tcMar>
+            <w:vAlign w:val="center"/>
+          </w:tcPr>
+          <w:p>
+            <w:r>
+              <w:rPr>
+                <w:rFonts w:ascii="Arial" w:cs="Arial" w:eastAsia="Arial" w:hAnsi="Arial"/>
+                <w:b/>
+                <w:bCs/>
+                <w:color w:val="333333"/>
+                <w:sz w:val="20"/>
+                <w:szCs w:val="20"/>
+              </w:rPr>
+              <w:t xml:space="preserve">T2 구현설계</w:t>
+            </w:r>
+          </w:p>
+        </w:tc>
+        <w:tc>
+          <w:tcPr>
+            <w:tcW w:type="dxa" w:w="2340"/>
+            <w:tcBorders>
+              <w:top w:val="single" w:color="CCCCCC" w:sz="1"/>
+              <w:left w:val="single" w:color="CCCCCC" w:sz="1"/>
+              <w:bottom w:val="single" w:color="CCCCCC" w:sz="1"/>
+              <w:right w:val="single" w:color="CCCCCC" w:sz="1"/>
+            </w:tcBorders>
+            <w:shd w:fill="FFFFFF" w:val="clear"/>
+            <w:tcMar>
+              <w:top w:type="dxa" w:w="80"/>
+              <w:left w:type="dxa" w:w="120"/>
+              <w:bottom w:type="dxa" w:w="80"/>
+              <w:right w:type="dxa" w:w="120"/>
+            </w:tcMar>
+            <w:vAlign w:val="center"/>
+          </w:tcPr>
+          <w:p>
+            <w:r>
+              <w:rPr>
+                <w:rFonts w:ascii="Arial" w:cs="Arial" w:eastAsia="Arial" w:hAnsi="Arial"/>
+                <w:b w:val="false"/>
+                <w:bCs w:val="false"/>
+                <w:color w:val="333333"/>
+                <w:sz w:val="20"/>
+                <w:szCs w:val="20"/>
+              </w:rPr>
+              <w:t xml:space="preserve">아키텍처 + API + 보안 설계</w:t>
+            </w:r>
+          </w:p>
+        </w:tc>
+        <w:tc>
+          <w:tcPr>
+            <w:tcW w:type="dxa" w:w="2340"/>
+            <w:tcBorders>
+              <w:top w:val="single" w:color="CCCCCC" w:sz="1"/>
+              <w:left w:val="single" w:color="CCCCCC" w:sz="1"/>
+              <w:bottom w:val="single" w:color="CCCCCC" w:sz="1"/>
+              <w:right w:val="single" w:color="CCCCCC" w:sz="1"/>
+            </w:tcBorders>
+            <w:shd w:fill="FFFFFF" w:val="clear"/>
+            <w:tcMar>
+              <w:top w:type="dxa" w:w="80"/>
+              <w:left w:type="dxa" w:w="120"/>
+              <w:bottom w:type="dxa" w:w="80"/>
+              <w:right w:type="dxa" w:w="120"/>
+            </w:tcMar>
+            <w:vAlign w:val="center"/>
+          </w:tcPr>
+          <w:p>
+            <w:r>
+              <w:rPr>
+                <w:rFonts w:ascii="Arial" w:cs="Arial" w:eastAsia="Arial" w:hAnsi="Arial"/>
+                <w:b w:val="false"/>
+                <w:bCs w:val="false"/>
+                <w:color w:val="333333"/>
+                <w:sz w:val="20"/>
+                <w:szCs w:val="20"/>
+              </w:rPr>
+              <w:t xml:space="preserve">6개</w:t>
+            </w:r>
+          </w:p>
+        </w:tc>
+        <w:tc>
+          <w:tcPr>
+            <w:tcW w:type="dxa" w:w="2340"/>
+            <w:tcBorders>
+              <w:top w:val="single" w:color="CCCCCC" w:sz="1"/>
+              <w:left w:val="single" w:color="CCCCCC" w:sz="1"/>
+              <w:bottom w:val="single" w:color="CCCCCC" w:sz="1"/>
+              <w:right w:val="single" w:color="CCCCCC" w:sz="1"/>
+            </w:tcBorders>
+            <w:shd w:fill="FFFFFF" w:val="clear"/>
+            <w:tcMar>
+              <w:top w:type="dxa" w:w="80"/>
+              <w:left w:type="dxa" w:w="120"/>
+              <w:bottom w:type="dxa" w:w="80"/>
+              <w:right w:type="dxa" w:w="120"/>
+            </w:tcMar>
+            <w:vAlign w:val="center"/>
+          </w:tcPr>
+          <w:p>
+            <w:r>
+              <w:rPr>
+                <w:rFonts w:ascii="Arial" w:cs="Arial" w:eastAsia="Arial" w:hAnsi="Arial"/>
+                <w:b w:val="false"/>
+                <w:bCs w:val="false"/>
+                <w:color w:val="333333"/>
+                <w:sz w:val="20"/>
+                <w:szCs w:val="20"/>
+              </w:rPr>
+              <w:t xml:space="preserve">시니어 개발자 1명 (월 600만원)</w:t>
+            </w:r>
+          </w:p>
+        </w:tc>
+      </w:tr>
+      <w:tr>
+        <w:tc>
+          <w:tcPr>
+            <w:tcW w:type="dxa" w:w="2340"/>
+            <w:tcBorders>
+              <w:top w:val="single" w:color="CCCCCC" w:sz="1"/>
+              <w:left w:val="single" w:color="CCCCCC" w:sz="1"/>
+              <w:bottom w:val="single" w:color="CCCCCC" w:sz="1"/>
+              <w:right w:val="single" w:color="CCCCCC" w:sz="1"/>
+            </w:tcBorders>
+            <w:shd w:fill="F5F5F5" w:val="clear"/>
+            <w:tcMar>
+              <w:top w:type="dxa" w:w="80"/>
+              <w:left w:type="dxa" w:w="120"/>
+              <w:bottom w:type="dxa" w:w="80"/>
+              <w:right w:type="dxa" w:w="120"/>
+            </w:tcMar>
+            <w:vAlign w:val="center"/>
+          </w:tcPr>
+          <w:p>
+            <w:r>
+              <w:rPr>
+                <w:rFonts w:ascii="Arial" w:cs="Arial" w:eastAsia="Arial" w:hAnsi="Arial"/>
+                <w:b/>
+                <w:bCs/>
+                <w:color w:val="333333"/>
+                <w:sz w:val="20"/>
+                <w:szCs w:val="20"/>
+              </w:rPr>
+              <w:t xml:space="preserve">T3 개발</w:t>
+            </w:r>
+          </w:p>
+        </w:tc>
+        <w:tc>
+          <w:tcPr>
+            <w:tcW w:type="dxa" w:w="2340"/>
+            <w:tcBorders>
+              <w:top w:val="single" w:color="CCCCCC" w:sz="1"/>
+              <w:left w:val="single" w:color="CCCCCC" w:sz="1"/>
+              <w:bottom w:val="single" w:color="CCCCCC" w:sz="1"/>
+              <w:right w:val="single" w:color="CCCCCC" w:sz="1"/>
+            </w:tcBorders>
+            <w:shd w:fill="FFFFFF" w:val="clear"/>
+            <w:tcMar>
+              <w:top w:type="dxa" w:w="80"/>
+              <w:left w:type="dxa" w:w="120"/>
+              <w:bottom w:type="dxa" w:w="80"/>
+              <w:right w:type="dxa" w:w="120"/>
+            </w:tcMar>
+            <w:vAlign w:val="center"/>
+          </w:tcPr>
+          <w:p>
+            <w:r>
+              <w:rPr>
+                <w:rFonts w:ascii="Arial" w:cs="Arial" w:eastAsia="Arial" w:hAnsi="Arial"/>
+                <w:b w:val="false"/>
+                <w:bCs w:val="false"/>
+                <w:color w:val="333333"/>
+                <w:sz w:val="20"/>
+                <w:szCs w:val="20"/>
+              </w:rPr>
+              <w:t xml:space="preserve">프론트/백엔드/인프라 병렬 코딩</w:t>
+            </w:r>
+          </w:p>
+        </w:tc>
+        <w:tc>
+          <w:tcPr>
+            <w:tcW w:type="dxa" w:w="2340"/>
+            <w:tcBorders>
+              <w:top w:val="single" w:color="CCCCCC" w:sz="1"/>
+              <w:left w:val="single" w:color="CCCCCC" w:sz="1"/>
+              <w:bottom w:val="single" w:color="CCCCCC" w:sz="1"/>
+              <w:right w:val="single" w:color="CCCCCC" w:sz="1"/>
+            </w:tcBorders>
+            <w:shd w:fill="FFFFFF" w:val="clear"/>
+            <w:tcMar>
+              <w:top w:type="dxa" w:w="80"/>
+              <w:left w:type="dxa" w:w="120"/>
+              <w:bottom w:type="dxa" w:w="80"/>
+              <w:right w:type="dxa" w:w="120"/>
+            </w:tcMar>
+            <w:vAlign w:val="center"/>
+          </w:tcPr>
+          <w:p>
+            <w:r>
+              <w:rPr>
+                <w:rFonts w:ascii="Arial" w:cs="Arial" w:eastAsia="Arial" w:hAnsi="Arial"/>
+                <w:b w:val="false"/>
+                <w:bCs w:val="false"/>
+                <w:color w:val="333333"/>
+                <w:sz w:val="20"/>
+                <w:szCs w:val="20"/>
+              </w:rPr>
+              <w:t xml:space="preserve">3~30개</w:t>
+            </w:r>
+          </w:p>
+        </w:tc>
+        <w:tc>
+          <w:tcPr>
+            <w:tcW w:type="dxa" w:w="2340"/>
+            <w:tcBorders>
+              <w:top w:val="single" w:color="CCCCCC" w:sz="1"/>
+              <w:left w:val="single" w:color="CCCCCC" w:sz="1"/>
+              <w:bottom w:val="single" w:color="CCCCCC" w:sz="1"/>
+              <w:right w:val="single" w:color="CCCCCC" w:sz="1"/>
+            </w:tcBorders>
+            <w:shd w:fill="FFFFFF" w:val="clear"/>
+            <w:tcMar>
+              <w:top w:type="dxa" w:w="80"/>
+              <w:left w:type="dxa" w:w="120"/>
+              <w:bottom w:type="dxa" w:w="80"/>
+              <w:right w:type="dxa" w:w="120"/>
+            </w:tcMar>
+            <w:vAlign w:val="center"/>
+          </w:tcPr>
+          <w:p>
+            <w:r>
+              <w:rPr>
+                <w:rFonts w:ascii="Arial" w:cs="Arial" w:eastAsia="Arial" w:hAnsi="Arial"/>
+                <w:b w:val="false"/>
+                <w:bCs w:val="false"/>
+                <w:color w:val="333333"/>
+                <w:sz w:val="20"/>
+                <w:szCs w:val="20"/>
+              </w:rPr>
+              <w:t xml:space="preserve">개발자 3명 (월 1,500만원)</w:t>
+            </w:r>
+          </w:p>
+        </w:tc>
+      </w:tr>
+      <w:tr>
+        <w:tc>
+          <w:tcPr>
+            <w:tcW w:type="dxa" w:w="2340"/>
+            <w:tcBorders>
+              <w:top w:val="single" w:color="CCCCCC" w:sz="1"/>
+              <w:left w:val="single" w:color="CCCCCC" w:sz="1"/>
+              <w:bottom w:val="single" w:color="CCCCCC" w:sz="1"/>
+              <w:right w:val="single" w:color="CCCCCC" w:sz="1"/>
+            </w:tcBorders>
+            <w:shd w:fill="F5F5F5" w:val="clear"/>
+            <w:tcMar>
+              <w:top w:type="dxa" w:w="80"/>
+              <w:left w:type="dxa" w:w="120"/>
+              <w:bottom w:type="dxa" w:w="80"/>
+              <w:right w:type="dxa" w:w="120"/>
+            </w:tcMar>
+            <w:vAlign w:val="center"/>
+          </w:tcPr>
+          <w:p>
+            <w:r>
+              <w:rPr>
+                <w:rFonts w:ascii="Arial" w:cs="Arial" w:eastAsia="Arial" w:hAnsi="Arial"/>
+                <w:b/>
+                <w:bCs/>
+                <w:color w:val="333333"/>
+                <w:sz w:val="20"/>
+                <w:szCs w:val="20"/>
+              </w:rPr>
+              <w:t xml:space="preserve">T4 QA</w:t>
+            </w:r>
+          </w:p>
+        </w:tc>
+        <w:tc>
+          <w:tcPr>
+            <w:tcW w:type="dxa" w:w="2340"/>
+            <w:tcBorders>
+              <w:top w:val="single" w:color="CCCCCC" w:sz="1"/>
+              <w:left w:val="single" w:color="CCCCCC" w:sz="1"/>
+              <w:bottom w:val="single" w:color="CCCCCC" w:sz="1"/>
+              <w:right w:val="single" w:color="CCCCCC" w:sz="1"/>
+            </w:tcBorders>
+            <w:shd w:fill="FFFFFF" w:val="clear"/>
+            <w:tcMar>
+              <w:top w:type="dxa" w:w="80"/>
+              <w:left w:type="dxa" w:w="120"/>
+              <w:bottom w:type="dxa" w:w="80"/>
+              <w:right w:type="dxa" w:w="120"/>
+            </w:tcMar>
+            <w:vAlign w:val="center"/>
+          </w:tcPr>
+          <w:p>
+            <w:r>
+              <w:rPr>
+                <w:rFonts w:ascii="Arial" w:cs="Arial" w:eastAsia="Arial" w:hAnsi="Arial"/>
+                <w:b w:val="false"/>
+                <w:bCs w:val="false"/>
+                <w:color w:val="333333"/>
+                <w:sz w:val="20"/>
+                <w:szCs w:val="20"/>
+              </w:rPr>
+              <w:t xml:space="preserve">16개 에이전트 3단계 자동 검수</w:t>
+            </w:r>
+          </w:p>
+        </w:tc>
+        <w:tc>
+          <w:tcPr>
+            <w:tcW w:type="dxa" w:w="2340"/>
+            <w:tcBorders>
+              <w:top w:val="single" w:color="CCCCCC" w:sz="1"/>
+              <w:left w:val="single" w:color="CCCCCC" w:sz="1"/>
+              <w:bottom w:val="single" w:color="CCCCCC" w:sz="1"/>
+              <w:right w:val="single" w:color="CCCCCC" w:sz="1"/>
+            </w:tcBorders>
+            <w:shd w:fill="FFFFFF" w:val="clear"/>
+            <w:tcMar>
+              <w:top w:type="dxa" w:w="80"/>
+              <w:left w:type="dxa" w:w="120"/>
+              <w:bottom w:type="dxa" w:w="80"/>
+              <w:right w:type="dxa" w:w="120"/>
+            </w:tcMar>
+            <w:vAlign w:val="center"/>
+          </w:tcPr>
+          <w:p>
+            <w:r>
+              <w:rPr>
+                <w:rFonts w:ascii="Arial" w:cs="Arial" w:eastAsia="Arial" w:hAnsi="Arial"/>
+                <w:b w:val="false"/>
+                <w:bCs w:val="false"/>
+                <w:color w:val="333333"/>
+                <w:sz w:val="20"/>
+                <w:szCs w:val="20"/>
+              </w:rPr>
+              <w:t xml:space="preserve">16개</w:t>
+            </w:r>
+          </w:p>
+        </w:tc>
+        <w:tc>
+          <w:tcPr>
+            <w:tcW w:type="dxa" w:w="2340"/>
+            <w:tcBorders>
+              <w:top w:val="single" w:color="CCCCCC" w:sz="1"/>
+              <w:left w:val="single" w:color="CCCCCC" w:sz="1"/>
+              <w:bottom w:val="single" w:color="CCCCCC" w:sz="1"/>
+              <w:right w:val="single" w:color="CCCCCC" w:sz="1"/>
+            </w:tcBorders>
+            <w:shd w:fill="FFFFFF" w:val="clear"/>
+            <w:tcMar>
+              <w:top w:type="dxa" w:w="80"/>
+              <w:left w:type="dxa" w:w="120"/>
+              <w:bottom w:type="dxa" w:w="80"/>
+              <w:right w:type="dxa" w:w="120"/>
+            </w:tcMar>
+            <w:vAlign w:val="center"/>
+          </w:tcPr>
+          <w:p>
+            <w:r>
+              <w:rPr>
+                <w:rFonts w:ascii="Arial" w:cs="Arial" w:eastAsia="Arial" w:hAnsi="Arial"/>
+                <w:b w:val="false"/>
+                <w:bCs w:val="false"/>
+                <w:color w:val="333333"/>
+                <w:sz w:val="20"/>
+                <w:szCs w:val="20"/>
+              </w:rPr>
+              <w:t xml:space="preserve">QA 1명 (월 400만원)</w:t>
+            </w:r>
+          </w:p>
+        </w:tc>
+      </w:tr>
+      <w:tr>
+        <w:tc>
+          <w:tcPr>
+            <w:tcW w:type="dxa" w:w="2340"/>
+            <w:tcBorders>
+              <w:top w:val="single" w:color="CCCCCC" w:sz="1"/>
+              <w:left w:val="single" w:color="CCCCCC" w:sz="1"/>
+              <w:bottom w:val="single" w:color="CCCCCC" w:sz="1"/>
+              <w:right w:val="single" w:color="CCCCCC" w:sz="1"/>
+            </w:tcBorders>
+            <w:shd w:fill="F5F5F5" w:val="clear"/>
+            <w:tcMar>
+              <w:top w:type="dxa" w:w="80"/>
+              <w:left w:type="dxa" w:w="120"/>
+              <w:bottom w:type="dxa" w:w="80"/>
+              <w:right w:type="dxa" w:w="120"/>
+            </w:tcMar>
+            <w:vAlign w:val="center"/>
+          </w:tcPr>
+          <w:p>
+            <w:r>
+              <w:rPr>
+                <w:rFonts w:ascii="Arial" w:cs="Arial" w:eastAsia="Arial" w:hAnsi="Arial"/>
+                <w:b/>
+                <w:bCs/>
+                <w:color w:val="333333"/>
+                <w:sz w:val="20"/>
+                <w:szCs w:val="20"/>
+              </w:rPr>
+              <w:t xml:space="preserve">T5 배포</w:t>
+            </w:r>
+          </w:p>
+        </w:tc>
+        <w:tc>
+          <w:tcPr>
+            <w:tcW w:type="dxa" w:w="2340"/>
+            <w:tcBorders>
+              <w:top w:val="single" w:color="CCCCCC" w:sz="1"/>
+              <w:left w:val="single" w:color="CCCCCC" w:sz="1"/>
+              <w:bottom w:val="single" w:color="CCCCCC" w:sz="1"/>
+              <w:right w:val="single" w:color="CCCCCC" w:sz="1"/>
+            </w:tcBorders>
+            <w:shd w:fill="FFFFFF" w:val="clear"/>
+            <w:tcMar>
+              <w:top w:type="dxa" w:w="80"/>
+              <w:left w:type="dxa" w:w="120"/>
+              <w:bottom w:type="dxa" w:w="80"/>
+              <w:right w:type="dxa" w:w="120"/>
+            </w:tcMar>
+            <w:vAlign w:val="center"/>
+          </w:tcPr>
+          <w:p>
+            <w:r>
+              <w:rPr>
+                <w:rFonts w:ascii="Arial" w:cs="Arial" w:eastAsia="Arial" w:hAnsi="Arial"/>
+                <w:b w:val="false"/>
+                <w:bCs w:val="false"/>
+                <w:color w:val="333333"/>
+                <w:sz w:val="20"/>
+                <w:szCs w:val="20"/>
+              </w:rPr>
+              <w:t xml:space="preserve">빌드 검증 + 롤백 + 문서화</w:t>
+            </w:r>
+          </w:p>
+        </w:tc>
+        <w:tc>
+          <w:tcPr>
+            <w:tcW w:type="dxa" w:w="2340"/>
+            <w:tcBorders>
+              <w:top w:val="single" w:color="CCCCCC" w:sz="1"/>
+              <w:left w:val="single" w:color="CCCCCC" w:sz="1"/>
+              <w:bottom w:val="single" w:color="CCCCCC" w:sz="1"/>
+              <w:right w:val="single" w:color="CCCCCC" w:sz="1"/>
+            </w:tcBorders>
+            <w:shd w:fill="FFFFFF" w:val="clear"/>
+            <w:tcMar>
+              <w:top w:type="dxa" w:w="80"/>
+              <w:left w:type="dxa" w:w="120"/>
+              <w:bottom w:type="dxa" w:w="80"/>
+              <w:right w:type="dxa" w:w="120"/>
+            </w:tcMar>
+            <w:vAlign w:val="center"/>
+          </w:tcPr>
+          <w:p>
+            <w:r>
+              <w:rPr>
+                <w:rFonts w:ascii="Arial" w:cs="Arial" w:eastAsia="Arial" w:hAnsi="Arial"/>
+                <w:b w:val="false"/>
+                <w:bCs w:val="false"/>
+                <w:color w:val="333333"/>
+                <w:sz w:val="20"/>
+                <w:szCs w:val="20"/>
+              </w:rPr>
+              <w:t xml:space="preserve">2개</w:t>
+            </w:r>
+          </w:p>
+        </w:tc>
+        <w:tc>
+          <w:tcPr>
+            <w:tcW w:type="dxa" w:w="2340"/>
+            <w:tcBorders>
+              <w:top w:val="single" w:color="CCCCCC" w:sz="1"/>
+              <w:left w:val="single" w:color="CCCCCC" w:sz="1"/>
+              <w:bottom w:val="single" w:color="CCCCCC" w:sz="1"/>
+              <w:right w:val="single" w:color="CCCCCC" w:sz="1"/>
+            </w:tcBorders>
+            <w:shd w:fill="FFFFFF" w:val="clear"/>
+            <w:tcMar>
+              <w:top w:type="dxa" w:w="80"/>
+              <w:left w:type="dxa" w:w="120"/>
+              <w:bottom w:type="dxa" w:w="80"/>
+              <w:right w:type="dxa" w:w="120"/>
+            </w:tcMar>
+            <w:vAlign w:val="center"/>
+          </w:tcPr>
+          <w:p>
+            <w:r>
+              <w:rPr>
+                <w:rFonts w:ascii="Arial" w:cs="Arial" w:eastAsia="Arial" w:hAnsi="Arial"/>
+                <w:b w:val="false"/>
+                <w:bCs w:val="false"/>
+                <w:color w:val="333333"/>
+                <w:sz w:val="20"/>
+                <w:szCs w:val="20"/>
+              </w:rPr>
+              <w:t xml:space="preserve">DevOps 1명 (월 500만원)</w:t>
+            </w:r>
+          </w:p>
+        </w:tc>
+      </w:tr>
+      <w:tr>
+        <w:tc>
+          <w:tcPr>
+            <w:tcW w:type="dxa" w:w="2340"/>
+            <w:tcBorders>
+              <w:top w:val="single" w:color="CCCCCC" w:sz="1"/>
+              <w:left w:val="single" w:color="CCCCCC" w:sz="1"/>
+              <w:bottom w:val="single" w:color="CCCCCC" w:sz="1"/>
+              <w:right w:val="single" w:color="CCCCCC" w:sz="1"/>
+            </w:tcBorders>
+            <w:shd w:fill="F5F5F5" w:val="clear"/>
+            <w:tcMar>
+              <w:top w:type="dxa" w:w="80"/>
+              <w:left w:type="dxa" w:w="120"/>
+              <w:bottom w:type="dxa" w:w="80"/>
+              <w:right w:type="dxa" w:w="120"/>
+            </w:tcMar>
+            <w:vAlign w:val="center"/>
+          </w:tcPr>
+          <w:p>
+            <w:r>
+              <w:rPr>
+                <w:rFonts w:ascii="Arial" w:cs="Arial" w:eastAsia="Arial" w:hAnsi="Arial"/>
+                <w:b/>
+                <w:bCs/>
+                <w:color w:val="333333"/>
+                <w:sz w:val="20"/>
+                <w:szCs w:val="20"/>
+              </w:rPr>
+              <w:t xml:space="preserve">T6 보안</w:t>
+            </w:r>
+          </w:p>
+        </w:tc>
+        <w:tc>
+          <w:tcPr>
+            <w:tcW w:type="dxa" w:w="2340"/>
+            <w:tcBorders>
+              <w:top w:val="single" w:color="CCCCCC" w:sz="1"/>
+              <w:left w:val="single" w:color="CCCCCC" w:sz="1"/>
+              <w:bottom w:val="single" w:color="CCCCCC" w:sz="1"/>
+              <w:right w:val="single" w:color="CCCCCC" w:sz="1"/>
+            </w:tcBorders>
+            <w:shd w:fill="FFFFFF" w:val="clear"/>
+            <w:tcMar>
+              <w:top w:type="dxa" w:w="80"/>
+              <w:left w:type="dxa" w:w="120"/>
+              <w:bottom w:type="dxa" w:w="80"/>
+              <w:right w:type="dxa" w:w="120"/>
+            </w:tcMar>
+            <w:vAlign w:val="center"/>
+          </w:tcPr>
+          <w:p>
+            <w:r>
+              <w:rPr>
+                <w:rFonts w:ascii="Arial" w:cs="Arial" w:eastAsia="Arial" w:hAnsi="Arial"/>
+                <w:b w:val="false"/>
+                <w:bCs w:val="false"/>
+                <w:color w:val="333333"/>
+                <w:sz w:val="20"/>
+                <w:szCs w:val="20"/>
+              </w:rPr>
+              <w:t xml:space="preserve">STRIDE + OWASP 자동 스캔</w:t>
+            </w:r>
+          </w:p>
+        </w:tc>
+        <w:tc>
+          <w:tcPr>
+            <w:tcW w:type="dxa" w:w="2340"/>
+            <w:tcBorders>
+              <w:top w:val="single" w:color="CCCCCC" w:sz="1"/>
+              <w:left w:val="single" w:color="CCCCCC" w:sz="1"/>
+              <w:bottom w:val="single" w:color="CCCCCC" w:sz="1"/>
+              <w:right w:val="single" w:color="CCCCCC" w:sz="1"/>
+            </w:tcBorders>
+            <w:shd w:fill="FFFFFF" w:val="clear"/>
+            <w:tcMar>
+              <w:top w:type="dxa" w:w="80"/>
+              <w:left w:type="dxa" w:w="120"/>
+              <w:bottom w:type="dxa" w:w="80"/>
+              <w:right w:type="dxa" w:w="120"/>
+            </w:tcMar>
+            <w:vAlign w:val="center"/>
+          </w:tcPr>
+          <w:p>
+            <w:r>
+              <w:rPr>
+                <w:rFonts w:ascii="Arial" w:cs="Arial" w:eastAsia="Arial" w:hAnsi="Arial"/>
+                <w:b w:val="false"/>
+                <w:bCs w:val="false"/>
+                <w:color w:val="333333"/>
+                <w:sz w:val="20"/>
+                <w:szCs w:val="20"/>
+              </w:rPr>
+              <w:t xml:space="preserve">2개</w:t>
+            </w:r>
+          </w:p>
+        </w:tc>
+        <w:tc>
+          <w:tcPr>
+            <w:tcW w:type="dxa" w:w="2340"/>
+            <w:tcBorders>
+              <w:top w:val="single" w:color="CCCCCC" w:sz="1"/>
+              <w:left w:val="single" w:color="CCCCCC" w:sz="1"/>
+              <w:bottom w:val="single" w:color="CCCCCC" w:sz="1"/>
+              <w:right w:val="single" w:color="CCCCCC" w:sz="1"/>
+            </w:tcBorders>
+            <w:shd w:fill="FFFFFF" w:val="clear"/>
+            <w:tcMar>
+              <w:top w:type="dxa" w:w="80"/>
+              <w:left w:type="dxa" w:w="120"/>
+              <w:bottom w:type="dxa" w:w="80"/>
+              <w:right w:type="dxa" w:w="120"/>
+            </w:tcMar>
+            <w:vAlign w:val="center"/>
+          </w:tcPr>
+          <w:p>
+            <w:r>
+              <w:rPr>
+                <w:rFonts w:ascii="Arial" w:cs="Arial" w:eastAsia="Arial" w:hAnsi="Arial"/>
+                <w:b w:val="false"/>
+                <w:bCs w:val="false"/>
+                <w:color w:val="333333"/>
+                <w:sz w:val="20"/>
+                <w:szCs w:val="20"/>
+              </w:rPr>
+              <w:t xml:space="preserve">보안 전문가 (월 600만원)</w:t>
+            </w:r>
+          </w:p>
+        </w:tc>
+      </w:tr>
+    </w:tbl>
+    <w:p>
+      <w:pPr>
+        <w:spacing w:after="100" w:before="100"/>
+      </w:pPr>
+    </w:p>
+    <w:p>
+      <w:pPr>
+        <w:spacing w:after="100" w:before="200"/>
+      </w:pPr>
+      <w:r>
+        <w:rPr>
+          <w:rFonts w:ascii="Arial" w:cs="Arial" w:eastAsia="Arial" w:hAnsi="Arial"/>
+          <w:b/>
+          <w:bCs/>
+          <w:color w:val="0066CC"/>
+          <w:sz w:val="24"/>
+          <w:szCs w:val="24"/>
+        </w:rPr>
+        <w:t xml:space="preserve">인건비 절감 효과</w:t>
+      </w:r>
+    </w:p>
+    <w:tbl>
+      <w:tblPr>
+        <w:tblW w:type="dxa" w:w="9360"/>
+        <w:tblBorders>
+          <w:top w:val="single" w:color="auto" w:sz="4"/>
+          <w:left w:val="single" w:color="auto" w:sz="4"/>
+          <w:bottom w:val="single" w:color="auto" w:sz="4"/>
+          <w:right w:val="single" w:color="auto" w:sz="4"/>
+          <w:insideH w:val="single" w:color="auto" w:sz="4"/>
+          <w:insideV w:val="single" w:color="auto" w:sz="4"/>
+        </w:tblBorders>
+      </w:tblPr>
+      <w:tblGrid>
+        <w:gridCol w:w="2340"/>
+        <w:gridCol w:w="2340"/>
+        <w:gridCol w:w="2340"/>
+        <w:gridCol w:w="2340"/>
+      </w:tblGrid>
+      <w:tr>
+        <w:tc>
+          <w:tcPr>
+            <w:tcW w:type="dxa" w:w="2340"/>
+            <w:tcBorders>
+              <w:top w:val="single" w:color="CCCCCC" w:sz="1"/>
+              <w:left w:val="single" w:color="CCCCCC" w:sz="1"/>
+              <w:bottom w:val="single" w:color="CCCCCC" w:sz="1"/>
+              <w:right w:val="single" w:color="CCCCCC" w:sz="1"/>
+            </w:tcBorders>
+            <w:shd w:fill="003366" w:val="clear"/>
+            <w:tcMar>
+              <w:top w:type="dxa" w:w="80"/>
+              <w:left w:type="dxa" w:w="120"/>
+              <w:bottom w:type="dxa" w:w="80"/>
+              <w:right w:type="dxa" w:w="120"/>
+            </w:tcMar>
+            <w:vAlign w:val="center"/>
+          </w:tcPr>
+          <w:p>
+            <w:r>
+              <w:rPr>
+                <w:rFonts w:ascii="Arial" w:cs="Arial" w:eastAsia="Arial" w:hAnsi="Arial"/>
+                <w:b/>
+                <w:bCs/>
+                <w:color w:val="FFFFFF"/>
+                <w:sz w:val="20"/>
+                <w:szCs w:val="20"/>
+              </w:rPr>
+              <w:t xml:space="preserve">항목</w:t>
+            </w:r>
+          </w:p>
+        </w:tc>
+        <w:tc>
+          <w:tcPr>
+            <w:tcW w:type="dxa" w:w="2340"/>
+            <w:tcBorders>
+              <w:top w:val="single" w:color="CCCCCC" w:sz="1"/>
+              <w:left w:val="single" w:color="CCCCCC" w:sz="1"/>
+              <w:bottom w:val="single" w:color="CCCCCC" w:sz="1"/>
+              <w:right w:val="single" w:color="CCCCCC" w:sz="1"/>
+            </w:tcBorders>
+            <w:shd w:fill="003366" w:val="clear"/>
+            <w:tcMar>
+              <w:top w:type="dxa" w:w="80"/>
+              <w:left w:type="dxa" w:w="120"/>
+              <w:bottom w:type="dxa" w:w="80"/>
+              <w:right w:type="dxa" w:w="120"/>
+            </w:tcMar>
+            <w:vAlign w:val="center"/>
+          </w:tcPr>
+          <w:p>
+            <w:r>
+              <w:rPr>
+                <w:rFonts w:ascii="Arial" w:cs="Arial" w:eastAsia="Arial" w:hAnsi="Arial"/>
+                <w:b/>
+                <w:bCs/>
+                <w:color w:val="FFFFFF"/>
+                <w:sz w:val="20"/>
+                <w:szCs w:val="20"/>
+              </w:rPr>
+              <w:t xml:space="preserve">일반 스타트업</w:t>
+            </w:r>
+          </w:p>
+        </w:tc>
+        <w:tc>
+          <w:tcPr>
+            <w:tcW w:type="dxa" w:w="2340"/>
+            <w:tcBorders>
+              <w:top w:val="single" w:color="CCCCCC" w:sz="1"/>
+              <w:left w:val="single" w:color="CCCCCC" w:sz="1"/>
+              <w:bottom w:val="single" w:color="CCCCCC" w:sz="1"/>
+              <w:right w:val="single" w:color="CCCCCC" w:sz="1"/>
+            </w:tcBorders>
+            <w:shd w:fill="003366" w:val="clear"/>
+            <w:tcMar>
+              <w:top w:type="dxa" w:w="80"/>
+              <w:left w:type="dxa" w:w="120"/>
+              <w:bottom w:type="dxa" w:w="80"/>
+              <w:right w:type="dxa" w:w="120"/>
+            </w:tcMar>
+            <w:vAlign w:val="center"/>
+          </w:tcPr>
+          <w:p>
+            <w:r>
+              <w:rPr>
+                <w:rFonts w:ascii="Arial" w:cs="Arial" w:eastAsia="Arial" w:hAnsi="Arial"/>
+                <w:b/>
+                <w:bCs/>
+                <w:color w:val="FFFFFF"/>
+                <w:sz w:val="20"/>
+                <w:szCs w:val="20"/>
+              </w:rPr>
+              <w:t xml:space="preserve">AI 개발팀 (라이트브라더스)</w:t>
+            </w:r>
+          </w:p>
+        </w:tc>
+        <w:tc>
+          <w:tcPr>
+            <w:tcW w:type="dxa" w:w="2340"/>
+            <w:tcBorders>
+              <w:top w:val="single" w:color="CCCCCC" w:sz="1"/>
+              <w:left w:val="single" w:color="CCCCCC" w:sz="1"/>
+              <w:bottom w:val="single" w:color="CCCCCC" w:sz="1"/>
+              <w:right w:val="single" w:color="CCCCCC" w:sz="1"/>
+            </w:tcBorders>
+            <w:shd w:fill="003366" w:val="clear"/>
+            <w:tcMar>
+              <w:top w:type="dxa" w:w="80"/>
+              <w:left w:type="dxa" w:w="120"/>
+              <w:bottom w:type="dxa" w:w="80"/>
+              <w:right w:type="dxa" w:w="120"/>
+            </w:tcMar>
+            <w:vAlign w:val="center"/>
+          </w:tcPr>
+          <w:p>
+            <w:r>
+              <w:rPr>
+                <w:rFonts w:ascii="Arial" w:cs="Arial" w:eastAsia="Arial" w:hAnsi="Arial"/>
+                <w:b/>
+                <w:bCs/>
+                <w:color w:val="FFFFFF"/>
+                <w:sz w:val="20"/>
+                <w:szCs w:val="20"/>
+              </w:rPr>
+              <w:t xml:space="preserve">절감</w:t>
+            </w:r>
+          </w:p>
+        </w:tc>
+      </w:tr>
+      <w:tr>
+        <w:tc>
+          <w:tcPr>
+            <w:tcW w:type="dxa" w:w="2340"/>
+            <w:tcBorders>
+              <w:top w:val="single" w:color="CCCCCC" w:sz="1"/>
+              <w:left w:val="single" w:color="CCCCCC" w:sz="1"/>
+              <w:bottom w:val="single" w:color="CCCCCC" w:sz="1"/>
+              <w:right w:val="single" w:color="CCCCCC" w:sz="1"/>
+            </w:tcBorders>
+            <w:shd w:fill="F5F5F5" w:val="clear"/>
+            <w:tcMar>
+              <w:top w:type="dxa" w:w="80"/>
+              <w:left w:type="dxa" w:w="120"/>
+              <w:bottom w:type="dxa" w:w="80"/>
+              <w:right w:type="dxa" w:w="120"/>
+            </w:tcMar>
+            <w:vAlign w:val="center"/>
+          </w:tcPr>
+          <w:p>
+            <w:r>
+              <w:rPr>
+                <w:rFonts w:ascii="Arial" w:cs="Arial" w:eastAsia="Arial" w:hAnsi="Arial"/>
+                <w:b/>
+                <w:bCs/>
+                <w:color w:val="333333"/>
+                <w:sz w:val="20"/>
+                <w:szCs w:val="20"/>
+              </w:rPr>
+              <w:t xml:space="preserve">개발자 3명</w:t>
+            </w:r>
+          </w:p>
+        </w:tc>
+        <w:tc>
+          <w:tcPr>
+            <w:tcW w:type="dxa" w:w="2340"/>
+            <w:tcBorders>
+              <w:top w:val="single" w:color="CCCCCC" w:sz="1"/>
+              <w:left w:val="single" w:color="CCCCCC" w:sz="1"/>
+              <w:bottom w:val="single" w:color="CCCCCC" w:sz="1"/>
+              <w:right w:val="single" w:color="CCCCCC" w:sz="1"/>
+            </w:tcBorders>
+            <w:shd w:fill="FFFFFF" w:val="clear"/>
+            <w:tcMar>
+              <w:top w:type="dxa" w:w="80"/>
+              <w:left w:type="dxa" w:w="120"/>
+              <w:bottom w:type="dxa" w:w="80"/>
+              <w:right w:type="dxa" w:w="120"/>
+            </w:tcMar>
+            <w:vAlign w:val="center"/>
+          </w:tcPr>
+          <w:p>
+            <w:r>
+              <w:rPr>
+                <w:rFonts w:ascii="Arial" w:cs="Arial" w:eastAsia="Arial" w:hAnsi="Arial"/>
+                <w:b w:val="false"/>
+                <w:bCs w:val="false"/>
+                <w:color w:val="333333"/>
+                <w:sz w:val="20"/>
+                <w:szCs w:val="20"/>
+              </w:rPr>
+              <w:t xml:space="preserve">월 1,500만원</w:t>
+            </w:r>
+          </w:p>
+        </w:tc>
+        <w:tc>
+          <w:tcPr>
+            <w:tcW w:type="dxa" w:w="2340"/>
+            <w:tcBorders>
+              <w:top w:val="single" w:color="CCCCCC" w:sz="1"/>
+              <w:left w:val="single" w:color="CCCCCC" w:sz="1"/>
+              <w:bottom w:val="single" w:color="CCCCCC" w:sz="1"/>
+              <w:right w:val="single" w:color="CCCCCC" w:sz="1"/>
+            </w:tcBorders>
+            <w:shd w:fill="FFFFFF" w:val="clear"/>
+            <w:tcMar>
+              <w:top w:type="dxa" w:w="80"/>
+              <w:left w:type="dxa" w:w="120"/>
+              <w:bottom w:type="dxa" w:w="80"/>
+              <w:right w:type="dxa" w:w="120"/>
+            </w:tcMar>
+            <w:vAlign w:val="center"/>
+          </w:tcPr>
+          <w:p>
+            <w:r>
+              <w:rPr>
+                <w:rFonts w:ascii="Arial" w:cs="Arial" w:eastAsia="Arial" w:hAnsi="Arial"/>
+                <w:b w:val="false"/>
+                <w:bCs w:val="false"/>
+                <w:color w:val="333333"/>
+                <w:sz w:val="20"/>
+                <w:szCs w:val="20"/>
+              </w:rPr>
+              <w:t xml:space="preserve">₩0 (Claude 구독만)</w:t>
+            </w:r>
+          </w:p>
+        </w:tc>
+        <w:tc>
+          <w:tcPr>
+            <w:tcW w:type="dxa" w:w="2340"/>
+            <w:tcBorders>
+              <w:top w:val="single" w:color="CCCCCC" w:sz="1"/>
+              <w:left w:val="single" w:color="CCCCCC" w:sz="1"/>
+              <w:bottom w:val="single" w:color="CCCCCC" w:sz="1"/>
+              <w:right w:val="single" w:color="CCCCCC" w:sz="1"/>
+            </w:tcBorders>
+            <w:shd w:fill="FFFFFF" w:val="clear"/>
+            <w:tcMar>
+              <w:top w:type="dxa" w:w="80"/>
+              <w:left w:type="dxa" w:w="120"/>
+              <w:bottom w:type="dxa" w:w="80"/>
+              <w:right w:type="dxa" w:w="120"/>
+            </w:tcMar>
+            <w:vAlign w:val="center"/>
+          </w:tcPr>
+          <w:p>
+            <w:r>
+              <w:rPr>
+                <w:rFonts w:ascii="Arial" w:cs="Arial" w:eastAsia="Arial" w:hAnsi="Arial"/>
+                <w:b w:val="false"/>
+                <w:bCs w:val="false"/>
+                <w:color w:val="333333"/>
+                <w:sz w:val="20"/>
+                <w:szCs w:val="20"/>
+              </w:rPr>
+              <w:t xml:space="preserve">100%</w:t>
+            </w:r>
+          </w:p>
+        </w:tc>
+      </w:tr>
+      <w:tr>
+        <w:tc>
+          <w:tcPr>
+            <w:tcW w:type="dxa" w:w="2340"/>
+            <w:tcBorders>
+              <w:top w:val="single" w:color="CCCCCC" w:sz="1"/>
+              <w:left w:val="single" w:color="CCCCCC" w:sz="1"/>
+              <w:bottom w:val="single" w:color="CCCCCC" w:sz="1"/>
+              <w:right w:val="single" w:color="CCCCCC" w:sz="1"/>
+            </w:tcBorders>
+            <w:shd w:fill="F5F5F5" w:val="clear"/>
+            <w:tcMar>
+              <w:top w:type="dxa" w:w="80"/>
+              <w:left w:type="dxa" w:w="120"/>
+              <w:bottom w:type="dxa" w:w="80"/>
+              <w:right w:type="dxa" w:w="120"/>
+            </w:tcMar>
+            <w:vAlign w:val="center"/>
+          </w:tcPr>
+          <w:p>
+            <w:r>
+              <w:rPr>
+                <w:rFonts w:ascii="Arial" w:cs="Arial" w:eastAsia="Arial" w:hAnsi="Arial"/>
+                <w:b/>
+                <w:bCs/>
+                <w:color w:val="333333"/>
+                <w:sz w:val="20"/>
+                <w:szCs w:val="20"/>
+              </w:rPr>
+              <w:t xml:space="preserve">QA 1명</w:t>
+            </w:r>
+          </w:p>
+        </w:tc>
+        <w:tc>
+          <w:tcPr>
+            <w:tcW w:type="dxa" w:w="2340"/>
+            <w:tcBorders>
+              <w:top w:val="single" w:color="CCCCCC" w:sz="1"/>
+              <w:left w:val="single" w:color="CCCCCC" w:sz="1"/>
+              <w:bottom w:val="single" w:color="CCCCCC" w:sz="1"/>
+              <w:right w:val="single" w:color="CCCCCC" w:sz="1"/>
+            </w:tcBorders>
+            <w:shd w:fill="FFFFFF" w:val="clear"/>
+            <w:tcMar>
+              <w:top w:type="dxa" w:w="80"/>
+              <w:left w:type="dxa" w:w="120"/>
+              <w:bottom w:type="dxa" w:w="80"/>
+              <w:right w:type="dxa" w:w="120"/>
+            </w:tcMar>
+            <w:vAlign w:val="center"/>
+          </w:tcPr>
+          <w:p>
+            <w:r>
+              <w:rPr>
+                <w:rFonts w:ascii="Arial" w:cs="Arial" w:eastAsia="Arial" w:hAnsi="Arial"/>
+                <w:b w:val="false"/>
+                <w:bCs w:val="false"/>
+                <w:color w:val="333333"/>
+                <w:sz w:val="20"/>
+                <w:szCs w:val="20"/>
+              </w:rPr>
+              <w:t xml:space="preserve">월 400만원</w:t>
+            </w:r>
+          </w:p>
+        </w:tc>
+        <w:tc>
+          <w:tcPr>
+            <w:tcW w:type="dxa" w:w="2340"/>
+            <w:tcBorders>
+              <w:top w:val="single" w:color="CCCCCC" w:sz="1"/>
+              <w:left w:val="single" w:color="CCCCCC" w:sz="1"/>
+              <w:bottom w:val="single" w:color="CCCCCC" w:sz="1"/>
+              <w:right w:val="single" w:color="CCCCCC" w:sz="1"/>
+            </w:tcBorders>
+            <w:shd w:fill="FFFFFF" w:val="clear"/>
+            <w:tcMar>
+              <w:top w:type="dxa" w:w="80"/>
+              <w:left w:type="dxa" w:w="120"/>
+              <w:bottom w:type="dxa" w:w="80"/>
+              <w:right w:type="dxa" w:w="120"/>
+            </w:tcMar>
+            <w:vAlign w:val="center"/>
+          </w:tcPr>
+          <w:p>
+            <w:r>
+              <w:rPr>
+                <w:rFonts w:ascii="Arial" w:cs="Arial" w:eastAsia="Arial" w:hAnsi="Arial"/>
+                <w:b w:val="false"/>
+                <w:bCs w:val="false"/>
+                <w:color w:val="333333"/>
+                <w:sz w:val="20"/>
+                <w:szCs w:val="20"/>
+              </w:rPr>
+              <w:t xml:space="preserve">₩0 (AI 자동)</w:t>
+            </w:r>
+          </w:p>
+        </w:tc>
+        <w:tc>
+          <w:tcPr>
+            <w:tcW w:type="dxa" w:w="2340"/>
+            <w:tcBorders>
+              <w:top w:val="single" w:color="CCCCCC" w:sz="1"/>
+              <w:left w:val="single" w:color="CCCCCC" w:sz="1"/>
+              <w:bottom w:val="single" w:color="CCCCCC" w:sz="1"/>
+              <w:right w:val="single" w:color="CCCCCC" w:sz="1"/>
+            </w:tcBorders>
+            <w:shd w:fill="FFFFFF" w:val="clear"/>
+            <w:tcMar>
+              <w:top w:type="dxa" w:w="80"/>
+              <w:left w:type="dxa" w:w="120"/>
+              <w:bottom w:type="dxa" w:w="80"/>
+              <w:right w:type="dxa" w:w="120"/>
+            </w:tcMar>
+            <w:vAlign w:val="center"/>
+          </w:tcPr>
+          <w:p>
+            <w:r>
+              <w:rPr>
+                <w:rFonts w:ascii="Arial" w:cs="Arial" w:eastAsia="Arial" w:hAnsi="Arial"/>
+                <w:b w:val="false"/>
+                <w:bCs w:val="false"/>
+                <w:color w:val="333333"/>
+                <w:sz w:val="20"/>
+                <w:szCs w:val="20"/>
+              </w:rPr>
+              <w:t xml:space="preserve">100%</w:t>
+            </w:r>
+          </w:p>
+        </w:tc>
+      </w:tr>
+      <w:tr>
+        <w:tc>
+          <w:tcPr>
+            <w:tcW w:type="dxa" w:w="2340"/>
+            <w:tcBorders>
+              <w:top w:val="single" w:color="CCCCCC" w:sz="1"/>
+              <w:left w:val="single" w:color="CCCCCC" w:sz="1"/>
+              <w:bottom w:val="single" w:color="CCCCCC" w:sz="1"/>
+              <w:right w:val="single" w:color="CCCCCC" w:sz="1"/>
+            </w:tcBorders>
+            <w:shd w:fill="F5F5F5" w:val="clear"/>
+            <w:tcMar>
+              <w:top w:type="dxa" w:w="80"/>
+              <w:left w:type="dxa" w:w="120"/>
+              <w:bottom w:type="dxa" w:w="80"/>
+              <w:right w:type="dxa" w:w="120"/>
+            </w:tcMar>
+            <w:vAlign w:val="center"/>
+          </w:tcPr>
+          <w:p>
+            <w:r>
+              <w:rPr>
+                <w:rFonts w:ascii="Arial" w:cs="Arial" w:eastAsia="Arial" w:hAnsi="Arial"/>
+                <w:b/>
+                <w:bCs/>
+                <w:color w:val="333333"/>
+                <w:sz w:val="20"/>
+                <w:szCs w:val="20"/>
+              </w:rPr>
+              <w:t xml:space="preserve">PM 1명</w:t>
+            </w:r>
+          </w:p>
+        </w:tc>
+        <w:tc>
+          <w:tcPr>
+            <w:tcW w:type="dxa" w:w="2340"/>
+            <w:tcBorders>
+              <w:top w:val="single" w:color="CCCCCC" w:sz="1"/>
+              <w:left w:val="single" w:color="CCCCCC" w:sz="1"/>
+              <w:bottom w:val="single" w:color="CCCCCC" w:sz="1"/>
+              <w:right w:val="single" w:color="CCCCCC" w:sz="1"/>
+            </w:tcBorders>
+            <w:shd w:fill="FFFFFF" w:val="clear"/>
+            <w:tcMar>
+              <w:top w:type="dxa" w:w="80"/>
+              <w:left w:type="dxa" w:w="120"/>
+              <w:bottom w:type="dxa" w:w="80"/>
+              <w:right w:type="dxa" w:w="120"/>
+            </w:tcMar>
+            <w:vAlign w:val="center"/>
+          </w:tcPr>
+          <w:p>
+            <w:r>
+              <w:rPr>
+                <w:rFonts w:ascii="Arial" w:cs="Arial" w:eastAsia="Arial" w:hAnsi="Arial"/>
+                <w:b w:val="false"/>
+                <w:bCs w:val="false"/>
+                <w:color w:val="333333"/>
+                <w:sz w:val="20"/>
+                <w:szCs w:val="20"/>
+              </w:rPr>
+              <w:t xml:space="preserve">월 500만원</w:t>
+            </w:r>
+          </w:p>
+        </w:tc>
+        <w:tc>
+          <w:tcPr>
+            <w:tcW w:type="dxa" w:w="2340"/>
+            <w:tcBorders>
+              <w:top w:val="single" w:color="CCCCCC" w:sz="1"/>
+              <w:left w:val="single" w:color="CCCCCC" w:sz="1"/>
+              <w:bottom w:val="single" w:color="CCCCCC" w:sz="1"/>
+              <w:right w:val="single" w:color="CCCCCC" w:sz="1"/>
+            </w:tcBorders>
+            <w:shd w:fill="FFFFFF" w:val="clear"/>
+            <w:tcMar>
+              <w:top w:type="dxa" w:w="80"/>
+              <w:left w:type="dxa" w:w="120"/>
+              <w:bottom w:type="dxa" w:w="80"/>
+              <w:right w:type="dxa" w:w="120"/>
+            </w:tcMar>
+            <w:vAlign w:val="center"/>
+          </w:tcPr>
+          <w:p>
+            <w:r>
+              <w:rPr>
+                <w:rFonts w:ascii="Arial" w:cs="Arial" w:eastAsia="Arial" w:hAnsi="Arial"/>
+                <w:b w:val="false"/>
+                <w:bCs w:val="false"/>
+                <w:color w:val="333333"/>
+                <w:sz w:val="20"/>
+                <w:szCs w:val="20"/>
+              </w:rPr>
+              <w:t xml:space="preserve">₩0 (T1 자동)</w:t>
+            </w:r>
+          </w:p>
+        </w:tc>
+        <w:tc>
+          <w:tcPr>
+            <w:tcW w:type="dxa" w:w="2340"/>
+            <w:tcBorders>
+              <w:top w:val="single" w:color="CCCCCC" w:sz="1"/>
+              <w:left w:val="single" w:color="CCCCCC" w:sz="1"/>
+              <w:bottom w:val="single" w:color="CCCCCC" w:sz="1"/>
+              <w:right w:val="single" w:color="CCCCCC" w:sz="1"/>
+            </w:tcBorders>
+            <w:shd w:fill="FFFFFF" w:val="clear"/>
+            <w:tcMar>
+              <w:top w:type="dxa" w:w="80"/>
+              <w:left w:type="dxa" w:w="120"/>
+              <w:bottom w:type="dxa" w:w="80"/>
+              <w:right w:type="dxa" w:w="120"/>
+            </w:tcMar>
+            <w:vAlign w:val="center"/>
+          </w:tcPr>
+          <w:p>
+            <w:r>
+              <w:rPr>
+                <w:rFonts w:ascii="Arial" w:cs="Arial" w:eastAsia="Arial" w:hAnsi="Arial"/>
+                <w:b w:val="false"/>
+                <w:bCs w:val="false"/>
+                <w:color w:val="333333"/>
+                <w:sz w:val="20"/>
+                <w:szCs w:val="20"/>
+              </w:rPr>
+              <w:t xml:space="preserve">100%</w:t>
+            </w:r>
+          </w:p>
+        </w:tc>
+      </w:tr>
+      <w:tr>
+        <w:tc>
+          <w:tcPr>
+            <w:tcW w:type="dxa" w:w="2340"/>
+            <w:tcBorders>
+              <w:top w:val="single" w:color="CCCCCC" w:sz="1"/>
+              <w:left w:val="single" w:color="CCCCCC" w:sz="1"/>
+              <w:bottom w:val="single" w:color="CCCCCC" w:sz="1"/>
+              <w:right w:val="single" w:color="CCCCCC" w:sz="1"/>
+            </w:tcBorders>
+            <w:shd w:fill="F5F5F5" w:val="clear"/>
+            <w:tcMar>
+              <w:top w:type="dxa" w:w="80"/>
+              <w:left w:type="dxa" w:w="120"/>
+              <w:bottom w:type="dxa" w:w="80"/>
+              <w:right w:type="dxa" w:w="120"/>
+            </w:tcMar>
+            <w:vAlign w:val="center"/>
+          </w:tcPr>
+          <w:p>
+            <w:r>
+              <w:rPr>
+                <w:rFonts w:ascii="Arial" w:cs="Arial" w:eastAsia="Arial" w:hAnsi="Arial"/>
+                <w:b/>
+                <w:bCs/>
+                <w:color w:val="333333"/>
+                <w:sz w:val="20"/>
+                <w:szCs w:val="20"/>
+              </w:rPr>
+              <w:t xml:space="preserve">DevOps 1명</w:t>
+            </w:r>
+          </w:p>
+        </w:tc>
+        <w:tc>
+          <w:tcPr>
+            <w:tcW w:type="dxa" w:w="2340"/>
+            <w:tcBorders>
+              <w:top w:val="single" w:color="CCCCCC" w:sz="1"/>
+              <w:left w:val="single" w:color="CCCCCC" w:sz="1"/>
+              <w:bottom w:val="single" w:color="CCCCCC" w:sz="1"/>
+              <w:right w:val="single" w:color="CCCCCC" w:sz="1"/>
+            </w:tcBorders>
+            <w:shd w:fill="FFFFFF" w:val="clear"/>
+            <w:tcMar>
+              <w:top w:type="dxa" w:w="80"/>
+              <w:left w:type="dxa" w:w="120"/>
+              <w:bottom w:type="dxa" w:w="80"/>
+              <w:right w:type="dxa" w:w="120"/>
+            </w:tcMar>
+            <w:vAlign w:val="center"/>
+          </w:tcPr>
+          <w:p>
+            <w:r>
+              <w:rPr>
+                <w:rFonts w:ascii="Arial" w:cs="Arial" w:eastAsia="Arial" w:hAnsi="Arial"/>
+                <w:b w:val="false"/>
+                <w:bCs w:val="false"/>
+                <w:color w:val="333333"/>
+                <w:sz w:val="20"/>
+                <w:szCs w:val="20"/>
+              </w:rPr>
+              <w:t xml:space="preserve">월 500만원</w:t>
+            </w:r>
+          </w:p>
+        </w:tc>
+        <w:tc>
+          <w:tcPr>
+            <w:tcW w:type="dxa" w:w="2340"/>
+            <w:tcBorders>
+              <w:top w:val="single" w:color="CCCCCC" w:sz="1"/>
+              <w:left w:val="single" w:color="CCCCCC" w:sz="1"/>
+              <w:bottom w:val="single" w:color="CCCCCC" w:sz="1"/>
+              <w:right w:val="single" w:color="CCCCCC" w:sz="1"/>
+            </w:tcBorders>
+            <w:shd w:fill="FFFFFF" w:val="clear"/>
+            <w:tcMar>
+              <w:top w:type="dxa" w:w="80"/>
+              <w:left w:type="dxa" w:w="120"/>
+              <w:bottom w:type="dxa" w:w="80"/>
+              <w:right w:type="dxa" w:w="120"/>
+            </w:tcMar>
+            <w:vAlign w:val="center"/>
+          </w:tcPr>
+          <w:p>
+            <w:r>
+              <w:rPr>
+                <w:rFonts w:ascii="Arial" w:cs="Arial" w:eastAsia="Arial" w:hAnsi="Arial"/>
+                <w:b w:val="false"/>
+                <w:bCs w:val="false"/>
+                <w:color w:val="333333"/>
+                <w:sz w:val="20"/>
+                <w:szCs w:val="20"/>
+              </w:rPr>
+              <w:t xml:space="preserve">₩0 (T5 자동)</w:t>
+            </w:r>
+          </w:p>
+        </w:tc>
+        <w:tc>
+          <w:tcPr>
+            <w:tcW w:type="dxa" w:w="2340"/>
+            <w:tcBorders>
+              <w:top w:val="single" w:color="CCCCCC" w:sz="1"/>
+              <w:left w:val="single" w:color="CCCCCC" w:sz="1"/>
+              <w:bottom w:val="single" w:color="CCCCCC" w:sz="1"/>
+              <w:right w:val="single" w:color="CCCCCC" w:sz="1"/>
+            </w:tcBorders>
+            <w:shd w:fill="FFFFFF" w:val="clear"/>
+            <w:tcMar>
+              <w:top w:type="dxa" w:w="80"/>
+              <w:left w:type="dxa" w:w="120"/>
+              <w:bottom w:type="dxa" w:w="80"/>
+              <w:right w:type="dxa" w:w="120"/>
+            </w:tcMar>
+            <w:vAlign w:val="center"/>
+          </w:tcPr>
+          <w:p>
+            <w:r>
+              <w:rPr>
+                <w:rFonts w:ascii="Arial" w:cs="Arial" w:eastAsia="Arial" w:hAnsi="Arial"/>
+                <w:b w:val="false"/>
+                <w:bCs w:val="false"/>
+                <w:color w:val="333333"/>
+                <w:sz w:val="20"/>
+                <w:szCs w:val="20"/>
+              </w:rPr>
+              <w:t xml:space="preserve">100%</w:t>
+            </w:r>
+          </w:p>
+        </w:tc>
+      </w:tr>
+      <w:tr>
+        <w:tc>
+          <w:tcPr>
+            <w:tcW w:type="dxa" w:w="2340"/>
+            <w:tcBorders>
+              <w:top w:val="single" w:color="CCCCCC" w:sz="1"/>
+              <w:left w:val="single" w:color="CCCCCC" w:sz="1"/>
+              <w:bottom w:val="single" w:color="CCCCCC" w:sz="1"/>
+              <w:right w:val="single" w:color="CCCCCC" w:sz="1"/>
+            </w:tcBorders>
+            <w:shd w:fill="F5F5F5" w:val="clear"/>
+            <w:tcMar>
+              <w:top w:type="dxa" w:w="80"/>
+              <w:left w:type="dxa" w:w="120"/>
+              <w:bottom w:type="dxa" w:w="80"/>
+              <w:right w:type="dxa" w:w="120"/>
+            </w:tcMar>
+            <w:vAlign w:val="center"/>
+          </w:tcPr>
+          <w:p>
+            <w:r>
+              <w:rPr>
+                <w:rFonts w:ascii="Arial" w:cs="Arial" w:eastAsia="Arial" w:hAnsi="Arial"/>
+                <w:b/>
+                <w:bCs/>
+                <w:color w:val="333333"/>
+                <w:sz w:val="20"/>
+                <w:szCs w:val="20"/>
+              </w:rPr>
+              <w:t xml:space="preserve">보안 전문가 (외주)</w:t>
+            </w:r>
+          </w:p>
+        </w:tc>
+        <w:tc>
+          <w:tcPr>
+            <w:tcW w:type="dxa" w:w="2340"/>
+            <w:tcBorders>
+              <w:top w:val="single" w:color="CCCCCC" w:sz="1"/>
+              <w:left w:val="single" w:color="CCCCCC" w:sz="1"/>
+              <w:bottom w:val="single" w:color="CCCCCC" w:sz="1"/>
+              <w:right w:val="single" w:color="CCCCCC" w:sz="1"/>
+            </w:tcBorders>
+            <w:shd w:fill="FFFFFF" w:val="clear"/>
+            <w:tcMar>
+              <w:top w:type="dxa" w:w="80"/>
+              <w:left w:type="dxa" w:w="120"/>
+              <w:bottom w:type="dxa" w:w="80"/>
+              <w:right w:type="dxa" w:w="120"/>
+            </w:tcMar>
+            <w:vAlign w:val="center"/>
+          </w:tcPr>
+          <w:p>
+            <w:r>
+              <w:rPr>
+                <w:rFonts w:ascii="Arial" w:cs="Arial" w:eastAsia="Arial" w:hAnsi="Arial"/>
+                <w:b w:val="false"/>
+                <w:bCs w:val="false"/>
+                <w:color w:val="333333"/>
+                <w:sz w:val="20"/>
+                <w:szCs w:val="20"/>
+              </w:rPr>
+              <w:t xml:space="preserve">월 300만원</w:t>
+            </w:r>
+          </w:p>
+        </w:tc>
+        <w:tc>
+          <w:tcPr>
+            <w:tcW w:type="dxa" w:w="2340"/>
+            <w:tcBorders>
+              <w:top w:val="single" w:color="CCCCCC" w:sz="1"/>
+              <w:left w:val="single" w:color="CCCCCC" w:sz="1"/>
+              <w:bottom w:val="single" w:color="CCCCCC" w:sz="1"/>
+              <w:right w:val="single" w:color="CCCCCC" w:sz="1"/>
+            </w:tcBorders>
+            <w:shd w:fill="FFFFFF" w:val="clear"/>
+            <w:tcMar>
+              <w:top w:type="dxa" w:w="80"/>
+              <w:left w:type="dxa" w:w="120"/>
+              <w:bottom w:type="dxa" w:w="80"/>
+              <w:right w:type="dxa" w:w="120"/>
+            </w:tcMar>
+            <w:vAlign w:val="center"/>
+          </w:tcPr>
+          <w:p>
+            <w:r>
+              <w:rPr>
+                <w:rFonts w:ascii="Arial" w:cs="Arial" w:eastAsia="Arial" w:hAnsi="Arial"/>
+                <w:b w:val="false"/>
+                <w:bCs w:val="false"/>
+                <w:color w:val="333333"/>
+                <w:sz w:val="20"/>
+                <w:szCs w:val="20"/>
+              </w:rPr>
+              <w:t xml:space="preserve">₩0 (T6 자동)</w:t>
+            </w:r>
+          </w:p>
+        </w:tc>
+        <w:tc>
+          <w:tcPr>
+            <w:tcW w:type="dxa" w:w="2340"/>
+            <w:tcBorders>
+              <w:top w:val="single" w:color="CCCCCC" w:sz="1"/>
+              <w:left w:val="single" w:color="CCCCCC" w:sz="1"/>
+              <w:bottom w:val="single" w:color="CCCCCC" w:sz="1"/>
+              <w:right w:val="single" w:color="CCCCCC" w:sz="1"/>
+            </w:tcBorders>
+            <w:shd w:fill="FFFFFF" w:val="clear"/>
+            <w:tcMar>
+              <w:top w:type="dxa" w:w="80"/>
+              <w:left w:type="dxa" w:w="120"/>
+              <w:bottom w:type="dxa" w:w="80"/>
+              <w:right w:type="dxa" w:w="120"/>
+            </w:tcMar>
+            <w:vAlign w:val="center"/>
+          </w:tcPr>
+          <w:p>
+            <w:r>
+              <w:rPr>
+                <w:rFonts w:ascii="Arial" w:cs="Arial" w:eastAsia="Arial" w:hAnsi="Arial"/>
+                <w:b w:val="false"/>
+                <w:bCs w:val="false"/>
+                <w:color w:val="333333"/>
+                <w:sz w:val="20"/>
+                <w:szCs w:val="20"/>
+              </w:rPr>
+              <w:t xml:space="preserve">100%</w:t>
+            </w:r>
+          </w:p>
+        </w:tc>
+      </w:tr>
+      <w:tr>
+        <w:tc>
+          <w:tcPr>
+            <w:tcW w:type="dxa" w:w="2340"/>
+            <w:tcBorders>
+              <w:top w:val="single" w:color="CCCCCC" w:sz="1"/>
+              <w:left w:val="single" w:color="CCCCCC" w:sz="1"/>
+              <w:bottom w:val="single" w:color="CCCCCC" w:sz="1"/>
+              <w:right w:val="single" w:color="CCCCCC" w:sz="1"/>
+            </w:tcBorders>
+            <w:shd w:fill="F5F5F5" w:val="clear"/>
+            <w:tcMar>
+              <w:top w:type="dxa" w:w="80"/>
+              <w:left w:type="dxa" w:w="120"/>
+              <w:bottom w:type="dxa" w:w="80"/>
+              <w:right w:type="dxa" w:w="120"/>
+            </w:tcMar>
+            <w:vAlign w:val="center"/>
+          </w:tcPr>
+          <w:p>
+            <w:r>
+              <w:rPr>
+                <w:rFonts w:ascii="Arial" w:cs="Arial" w:eastAsia="Arial" w:hAnsi="Arial"/>
+                <w:b/>
+                <w:bCs/>
+                <w:color w:val="333333"/>
+                <w:sz w:val="20"/>
+                <w:szCs w:val="20"/>
+              </w:rPr>
+              <w:t xml:space="preserve">합계</w:t>
+            </w:r>
+          </w:p>
+        </w:tc>
+        <w:tc>
+          <w:tcPr>
+            <w:tcW w:type="dxa" w:w="2340"/>
+            <w:tcBorders>
+              <w:top w:val="single" w:color="CCCCCC" w:sz="1"/>
+              <w:left w:val="single" w:color="CCCCCC" w:sz="1"/>
+              <w:bottom w:val="single" w:color="CCCCCC" w:sz="1"/>
+              <w:right w:val="single" w:color="CCCCCC" w:sz="1"/>
+            </w:tcBorders>
+            <w:shd w:fill="FFFFFF" w:val="clear"/>
+            <w:tcMar>
+              <w:top w:type="dxa" w:w="80"/>
+              <w:left w:type="dxa" w:w="120"/>
+              <w:bottom w:type="dxa" w:w="80"/>
+              <w:right w:type="dxa" w:w="120"/>
+            </w:tcMar>
+            <w:vAlign w:val="center"/>
+          </w:tcPr>
+          <w:p>
+            <w:r>
+              <w:rPr>
+                <w:rFonts w:ascii="Arial" w:cs="Arial" w:eastAsia="Arial" w:hAnsi="Arial"/>
+                <w:b w:val="false"/>
+                <w:bCs w:val="false"/>
+                <w:color w:val="333333"/>
+                <w:sz w:val="20"/>
+                <w:szCs w:val="20"/>
+              </w:rPr>
+              <w:t xml:space="preserve">월 3,200만원</w:t>
+            </w:r>
+          </w:p>
+        </w:tc>
+        <w:tc>
+          <w:tcPr>
+            <w:tcW w:type="dxa" w:w="2340"/>
+            <w:tcBorders>
+              <w:top w:val="single" w:color="CCCCCC" w:sz="1"/>
+              <w:left w:val="single" w:color="CCCCCC" w:sz="1"/>
+              <w:bottom w:val="single" w:color="CCCCCC" w:sz="1"/>
+              <w:right w:val="single" w:color="CCCCCC" w:sz="1"/>
+            </w:tcBorders>
+            <w:shd w:fill="FFFFFF" w:val="clear"/>
+            <w:tcMar>
+              <w:top w:type="dxa" w:w="80"/>
+              <w:left w:type="dxa" w:w="120"/>
+              <w:bottom w:type="dxa" w:w="80"/>
+              <w:right w:type="dxa" w:w="120"/>
+            </w:tcMar>
+            <w:vAlign w:val="center"/>
+          </w:tcPr>
+          <w:p>
+            <w:r>
+              <w:rPr>
+                <w:rFonts w:ascii="Arial" w:cs="Arial" w:eastAsia="Arial" w:hAnsi="Arial"/>
+                <w:b w:val="false"/>
+                <w:bCs w:val="false"/>
+                <w:color w:val="333333"/>
+                <w:sz w:val="20"/>
+                <w:szCs w:val="20"/>
+              </w:rPr>
+              <w:t xml:space="preserve">Claude 구독 ~20만원</w:t>
+            </w:r>
+          </w:p>
+        </w:tc>
+        <w:tc>
+          <w:tcPr>
+            <w:tcW w:type="dxa" w:w="2340"/>
+            <w:tcBorders>
+              <w:top w:val="single" w:color="CCCCCC" w:sz="1"/>
+              <w:left w:val="single" w:color="CCCCCC" w:sz="1"/>
+              <w:bottom w:val="single" w:color="CCCCCC" w:sz="1"/>
+              <w:right w:val="single" w:color="CCCCCC" w:sz="1"/>
+            </w:tcBorders>
+            <w:shd w:fill="FFFFFF" w:val="clear"/>
+            <w:tcMar>
+              <w:top w:type="dxa" w:w="80"/>
+              <w:left w:type="dxa" w:w="120"/>
+              <w:bottom w:type="dxa" w:w="80"/>
+              <w:right w:type="dxa" w:w="120"/>
+            </w:tcMar>
+            <w:vAlign w:val="center"/>
+          </w:tcPr>
+          <w:p>
+            <w:r>
+              <w:rPr>
+                <w:rFonts w:ascii="Arial" w:cs="Arial" w:eastAsia="Arial" w:hAnsi="Arial"/>
+                <w:b w:val="false"/>
+                <w:bCs w:val="false"/>
+                <w:color w:val="333333"/>
+                <w:sz w:val="20"/>
+                <w:szCs w:val="20"/>
+              </w:rPr>
+              <w:t xml:space="preserve">99.4%</w:t>
+            </w:r>
+          </w:p>
+        </w:tc>
+      </w:tr>
+      <w:tr>
+        <w:tc>
+          <w:tcPr>
+            <w:tcW w:type="dxa" w:w="2340"/>
+            <w:tcBorders>
+              <w:top w:val="single" w:color="CCCCCC" w:sz="1"/>
+              <w:left w:val="single" w:color="CCCCCC" w:sz="1"/>
+              <w:bottom w:val="single" w:color="CCCCCC" w:sz="1"/>
+              <w:right w:val="single" w:color="CCCCCC" w:sz="1"/>
+            </w:tcBorders>
+            <w:shd w:fill="F5F5F5" w:val="clear"/>
+            <w:tcMar>
+              <w:top w:type="dxa" w:w="80"/>
+              <w:left w:type="dxa" w:w="120"/>
+              <w:bottom w:type="dxa" w:w="80"/>
+              <w:right w:type="dxa" w:w="120"/>
+            </w:tcMar>
+            <w:vAlign w:val="center"/>
+          </w:tcPr>
+          <w:p>
+            <w:r>
+              <w:rPr>
+                <w:rFonts w:ascii="Arial" w:cs="Arial" w:eastAsia="Arial" w:hAnsi="Arial"/>
+                <w:b/>
+                <w:bCs/>
+                <w:color w:val="333333"/>
+                <w:sz w:val="20"/>
+                <w:szCs w:val="20"/>
+              </w:rPr>
+              <w:t xml:space="preserve">연간</w:t>
+            </w:r>
+          </w:p>
+        </w:tc>
+        <w:tc>
+          <w:tcPr>
+            <w:tcW w:type="dxa" w:w="2340"/>
+            <w:tcBorders>
+              <w:top w:val="single" w:color="CCCCCC" w:sz="1"/>
+              <w:left w:val="single" w:color="CCCCCC" w:sz="1"/>
+              <w:bottom w:val="single" w:color="CCCCCC" w:sz="1"/>
+              <w:right w:val="single" w:color="CCCCCC" w:sz="1"/>
+            </w:tcBorders>
+            <w:shd w:fill="FFFFFF" w:val="clear"/>
+            <w:tcMar>
+              <w:top w:type="dxa" w:w="80"/>
+              <w:left w:type="dxa" w:w="120"/>
+              <w:bottom w:type="dxa" w:w="80"/>
+              <w:right w:type="dxa" w:w="120"/>
+            </w:tcMar>
+            <w:vAlign w:val="center"/>
+          </w:tcPr>
+          <w:p>
+            <w:r>
+              <w:rPr>
+                <w:rFonts w:ascii="Arial" w:cs="Arial" w:eastAsia="Arial" w:hAnsi="Arial"/>
+                <w:b w:val="false"/>
+                <w:bCs w:val="false"/>
+                <w:color w:val="333333"/>
+                <w:sz w:val="20"/>
+                <w:szCs w:val="20"/>
+              </w:rPr>
+              <w:t xml:space="preserve">3.84억원</w:t>
+            </w:r>
+          </w:p>
+        </w:tc>
+        <w:tc>
+          <w:tcPr>
+            <w:tcW w:type="dxa" w:w="2340"/>
+            <w:tcBorders>
+              <w:top w:val="single" w:color="CCCCCC" w:sz="1"/>
+              <w:left w:val="single" w:color="CCCCCC" w:sz="1"/>
+              <w:bottom w:val="single" w:color="CCCCCC" w:sz="1"/>
+              <w:right w:val="single" w:color="CCCCCC" w:sz="1"/>
+            </w:tcBorders>
+            <w:shd w:fill="FFFFFF" w:val="clear"/>
+            <w:tcMar>
+              <w:top w:type="dxa" w:w="80"/>
+              <w:left w:type="dxa" w:w="120"/>
+              <w:bottom w:type="dxa" w:w="80"/>
+              <w:right w:type="dxa" w:w="120"/>
+            </w:tcMar>
+            <w:vAlign w:val="center"/>
+          </w:tcPr>
+          <w:p>
+            <w:r>
+              <w:rPr>
+                <w:rFonts w:ascii="Arial" w:cs="Arial" w:eastAsia="Arial" w:hAnsi="Arial"/>
+                <w:b w:val="false"/>
+                <w:bCs w:val="false"/>
+                <w:color w:val="333333"/>
+                <w:sz w:val="20"/>
+                <w:szCs w:val="20"/>
+              </w:rPr>
+              <w:t xml:space="preserve">~240만원</w:t>
+            </w:r>
+          </w:p>
+        </w:tc>
+        <w:tc>
+          <w:tcPr>
+            <w:tcW w:type="dxa" w:w="2340"/>
+            <w:tcBorders>
+              <w:top w:val="single" w:color="CCCCCC" w:sz="1"/>
+              <w:left w:val="single" w:color="CCCCCC" w:sz="1"/>
+              <w:bottom w:val="single" w:color="CCCCCC" w:sz="1"/>
+              <w:right w:val="single" w:color="CCCCCC" w:sz="1"/>
+            </w:tcBorders>
+            <w:shd w:fill="FFFFFF" w:val="clear"/>
+            <w:tcMar>
+              <w:top w:type="dxa" w:w="80"/>
+              <w:left w:type="dxa" w:w="120"/>
+              <w:bottom w:type="dxa" w:w="80"/>
+              <w:right w:type="dxa" w:w="120"/>
+            </w:tcMar>
+            <w:vAlign w:val="center"/>
+          </w:tcPr>
+          <w:p>
+            <w:r>
+              <w:rPr>
+                <w:rFonts w:ascii="Arial" w:cs="Arial" w:eastAsia="Arial" w:hAnsi="Arial"/>
+                <w:b w:val="false"/>
+                <w:bCs w:val="false"/>
+                <w:color w:val="333333"/>
+                <w:sz w:val="20"/>
+                <w:szCs w:val="20"/>
+              </w:rPr>
+              <w:t xml:space="preserve">연 3.6억원 절감</w:t>
+            </w:r>
+          </w:p>
+        </w:tc>
+      </w:tr>
+    </w:tbl>
+    <w:p>
+      <w:pPr>
+        <w:spacing w:after="100" w:before="100"/>
+      </w:pPr>
+    </w:p>
+    <w:p>
+      <w:pPr>
+        <w:spacing w:after="100" w:before="200"/>
+      </w:pPr>
+      <w:r>
+        <w:rPr>
+          <w:rFonts w:ascii="Arial" w:cs="Arial" w:eastAsia="Arial" w:hAnsi="Arial"/>
+          <w:b/>
+          <w:bCs/>
+          <w:color w:val="0066CC"/>
+          <w:sz w:val="24"/>
+          <w:szCs w:val="24"/>
+        </w:rPr>
+        <w:t xml:space="preserve">속도 향상 효과</w:t>
+      </w:r>
+    </w:p>
+    <w:tbl>
+      <w:tblPr>
+        <w:tblW w:type="dxa" w:w="9360"/>
+        <w:tblBorders>
+          <w:top w:val="single" w:color="auto" w:sz="4"/>
+          <w:left w:val="single" w:color="auto" w:sz="4"/>
+          <w:bottom w:val="single" w:color="auto" w:sz="4"/>
+          <w:right w:val="single" w:color="auto" w:sz="4"/>
+          <w:insideH w:val="single" w:color="auto" w:sz="4"/>
+          <w:insideV w:val="single" w:color="auto" w:sz="4"/>
+        </w:tblBorders>
+      </w:tblPr>
+      <w:tblGrid>
+        <w:gridCol w:w="2340"/>
+        <w:gridCol w:w="2340"/>
+        <w:gridCol w:w="2340"/>
+        <w:gridCol w:w="2340"/>
+      </w:tblGrid>
+      <w:tr>
+        <w:tc>
+          <w:tcPr>
+            <w:tcW w:type="dxa" w:w="2340"/>
+            <w:tcBorders>
+              <w:top w:val="single" w:color="CCCCCC" w:sz="1"/>
+              <w:left w:val="single" w:color="CCCCCC" w:sz="1"/>
+              <w:bottom w:val="single" w:color="CCCCCC" w:sz="1"/>
+              <w:right w:val="single" w:color="CCCCCC" w:sz="1"/>
+            </w:tcBorders>
+            <w:shd w:fill="003366" w:val="clear"/>
+            <w:tcMar>
+              <w:top w:type="dxa" w:w="80"/>
+              <w:left w:type="dxa" w:w="120"/>
+              <w:bottom w:type="dxa" w:w="80"/>
+              <w:right w:type="dxa" w:w="120"/>
+            </w:tcMar>
+            <w:vAlign w:val="center"/>
+          </w:tcPr>
+          <w:p>
+            <w:r>
+              <w:rPr>
+                <w:rFonts w:ascii="Arial" w:cs="Arial" w:eastAsia="Arial" w:hAnsi="Arial"/>
+                <w:b/>
+                <w:bCs/>
+                <w:color w:val="FFFFFF"/>
+                <w:sz w:val="20"/>
+                <w:szCs w:val="20"/>
+              </w:rPr>
+              <w:t xml:space="preserve">항목</w:t>
+            </w:r>
+          </w:p>
+        </w:tc>
+        <w:tc>
+          <w:tcPr>
+            <w:tcW w:type="dxa" w:w="2340"/>
+            <w:tcBorders>
+              <w:top w:val="single" w:color="CCCCCC" w:sz="1"/>
+              <w:left w:val="single" w:color="CCCCCC" w:sz="1"/>
+              <w:bottom w:val="single" w:color="CCCCCC" w:sz="1"/>
+              <w:right w:val="single" w:color="CCCCCC" w:sz="1"/>
+            </w:tcBorders>
+            <w:shd w:fill="003366" w:val="clear"/>
+            <w:tcMar>
+              <w:top w:type="dxa" w:w="80"/>
+              <w:left w:type="dxa" w:w="120"/>
+              <w:bottom w:type="dxa" w:w="80"/>
+              <w:right w:type="dxa" w:w="120"/>
+            </w:tcMar>
+            <w:vAlign w:val="center"/>
+          </w:tcPr>
+          <w:p>
+            <w:r>
+              <w:rPr>
+                <w:rFonts w:ascii="Arial" w:cs="Arial" w:eastAsia="Arial" w:hAnsi="Arial"/>
+                <w:b/>
+                <w:bCs/>
+                <w:color w:val="FFFFFF"/>
+                <w:sz w:val="20"/>
+                <w:szCs w:val="20"/>
+              </w:rPr>
+              <w:t xml:space="preserve">AI 팀 없이</w:t>
+            </w:r>
+          </w:p>
+        </w:tc>
+        <w:tc>
+          <w:tcPr>
+            <w:tcW w:type="dxa" w:w="2340"/>
+            <w:tcBorders>
+              <w:top w:val="single" w:color="CCCCCC" w:sz="1"/>
+              <w:left w:val="single" w:color="CCCCCC" w:sz="1"/>
+              <w:bottom w:val="single" w:color="CCCCCC" w:sz="1"/>
+              <w:right w:val="single" w:color="CCCCCC" w:sz="1"/>
+            </w:tcBorders>
+            <w:shd w:fill="003366" w:val="clear"/>
+            <w:tcMar>
+              <w:top w:type="dxa" w:w="80"/>
+              <w:left w:type="dxa" w:w="120"/>
+              <w:bottom w:type="dxa" w:w="80"/>
+              <w:right w:type="dxa" w:w="120"/>
+            </w:tcMar>
+            <w:vAlign w:val="center"/>
+          </w:tcPr>
+          <w:p>
+            <w:r>
+              <w:rPr>
+                <w:rFonts w:ascii="Arial" w:cs="Arial" w:eastAsia="Arial" w:hAnsi="Arial"/>
+                <w:b/>
+                <w:bCs/>
+                <w:color w:val="FFFFFF"/>
+                <w:sz w:val="20"/>
+                <w:szCs w:val="20"/>
+              </w:rPr>
+              <w:t xml:space="preserve">AI 팀 적용</w:t>
+            </w:r>
+          </w:p>
+        </w:tc>
+        <w:tc>
+          <w:tcPr>
+            <w:tcW w:type="dxa" w:w="2340"/>
+            <w:tcBorders>
+              <w:top w:val="single" w:color="CCCCCC" w:sz="1"/>
+              <w:left w:val="single" w:color="CCCCCC" w:sz="1"/>
+              <w:bottom w:val="single" w:color="CCCCCC" w:sz="1"/>
+              <w:right w:val="single" w:color="CCCCCC" w:sz="1"/>
+            </w:tcBorders>
+            <w:shd w:fill="003366" w:val="clear"/>
+            <w:tcMar>
+              <w:top w:type="dxa" w:w="80"/>
+              <w:left w:type="dxa" w:w="120"/>
+              <w:bottom w:type="dxa" w:w="80"/>
+              <w:right w:type="dxa" w:w="120"/>
+            </w:tcMar>
+            <w:vAlign w:val="center"/>
+          </w:tcPr>
+          <w:p>
+            <w:r>
+              <w:rPr>
+                <w:rFonts w:ascii="Arial" w:cs="Arial" w:eastAsia="Arial" w:hAnsi="Arial"/>
+                <w:b/>
+                <w:bCs/>
+                <w:color w:val="FFFFFF"/>
+                <w:sz w:val="20"/>
+                <w:szCs w:val="20"/>
+              </w:rPr>
+              <w:t xml:space="preserve">개선</w:t>
+            </w:r>
+          </w:p>
+        </w:tc>
+      </w:tr>
+      <w:tr>
+        <w:tc>
+          <w:tcPr>
+            <w:tcW w:type="dxa" w:w="2340"/>
+            <w:tcBorders>
+              <w:top w:val="single" w:color="CCCCCC" w:sz="1"/>
+              <w:left w:val="single" w:color="CCCCCC" w:sz="1"/>
+              <w:bottom w:val="single" w:color="CCCCCC" w:sz="1"/>
+              <w:right w:val="single" w:color="CCCCCC" w:sz="1"/>
+            </w:tcBorders>
+            <w:shd w:fill="F5F5F5" w:val="clear"/>
+            <w:tcMar>
+              <w:top w:type="dxa" w:w="80"/>
+              <w:left w:type="dxa" w:w="120"/>
+              <w:bottom w:type="dxa" w:w="80"/>
+              <w:right w:type="dxa" w:w="120"/>
+            </w:tcMar>
+            <w:vAlign w:val="center"/>
+          </w:tcPr>
+          <w:p>
+            <w:r>
+              <w:rPr>
+                <w:rFonts w:ascii="Arial" w:cs="Arial" w:eastAsia="Arial" w:hAnsi="Arial"/>
+                <w:b/>
+                <w:bCs/>
+                <w:color w:val="333333"/>
+                <w:sz w:val="20"/>
+                <w:szCs w:val="20"/>
+              </w:rPr>
+              <w:t xml:space="preserve">Phase 1~3 완료</w:t>
+            </w:r>
+          </w:p>
+        </w:tc>
+        <w:tc>
+          <w:tcPr>
+            <w:tcW w:type="dxa" w:w="2340"/>
+            <w:tcBorders>
+              <w:top w:val="single" w:color="CCCCCC" w:sz="1"/>
+              <w:left w:val="single" w:color="CCCCCC" w:sz="1"/>
+              <w:bottom w:val="single" w:color="CCCCCC" w:sz="1"/>
+              <w:right w:val="single" w:color="CCCCCC" w:sz="1"/>
+            </w:tcBorders>
+            <w:shd w:fill="FFFFFF" w:val="clear"/>
+            <w:tcMar>
+              <w:top w:type="dxa" w:w="80"/>
+              <w:left w:type="dxa" w:w="120"/>
+              <w:bottom w:type="dxa" w:w="80"/>
+              <w:right w:type="dxa" w:w="120"/>
+            </w:tcMar>
+            <w:vAlign w:val="center"/>
+          </w:tcPr>
+          <w:p>
+            <w:r>
+              <w:rPr>
+                <w:rFonts w:ascii="Arial" w:cs="Arial" w:eastAsia="Arial" w:hAnsi="Arial"/>
+                <w:b w:val="false"/>
+                <w:bCs w:val="false"/>
+                <w:color w:val="333333"/>
+                <w:sz w:val="20"/>
+                <w:szCs w:val="20"/>
+              </w:rPr>
+              <w:t xml:space="preserve">38주</w:t>
+            </w:r>
+          </w:p>
+        </w:tc>
+        <w:tc>
+          <w:tcPr>
+            <w:tcW w:type="dxa" w:w="2340"/>
+            <w:tcBorders>
+              <w:top w:val="single" w:color="CCCCCC" w:sz="1"/>
+              <w:left w:val="single" w:color="CCCCCC" w:sz="1"/>
+              <w:bottom w:val="single" w:color="CCCCCC" w:sz="1"/>
+              <w:right w:val="single" w:color="CCCCCC" w:sz="1"/>
+            </w:tcBorders>
+            <w:shd w:fill="FFFFFF" w:val="clear"/>
+            <w:tcMar>
+              <w:top w:type="dxa" w:w="80"/>
+              <w:left w:type="dxa" w:w="120"/>
+              <w:bottom w:type="dxa" w:w="80"/>
+              <w:right w:type="dxa" w:w="120"/>
+            </w:tcMar>
+            <w:vAlign w:val="center"/>
+          </w:tcPr>
+          <w:p>
+            <w:r>
+              <w:rPr>
+                <w:rFonts w:ascii="Arial" w:cs="Arial" w:eastAsia="Arial" w:hAnsi="Arial"/>
+                <w:b w:val="false"/>
+                <w:bCs w:val="false"/>
+                <w:color w:val="333333"/>
+                <w:sz w:val="20"/>
+                <w:szCs w:val="20"/>
+              </w:rPr>
+              <w:t xml:space="preserve">25.5주</w:t>
+            </w:r>
+          </w:p>
+        </w:tc>
+        <w:tc>
+          <w:tcPr>
+            <w:tcW w:type="dxa" w:w="2340"/>
+            <w:tcBorders>
+              <w:top w:val="single" w:color="CCCCCC" w:sz="1"/>
+              <w:left w:val="single" w:color="CCCCCC" w:sz="1"/>
+              <w:bottom w:val="single" w:color="CCCCCC" w:sz="1"/>
+              <w:right w:val="single" w:color="CCCCCC" w:sz="1"/>
+            </w:tcBorders>
+            <w:shd w:fill="FFFFFF" w:val="clear"/>
+            <w:tcMar>
+              <w:top w:type="dxa" w:w="80"/>
+              <w:left w:type="dxa" w:w="120"/>
+              <w:bottom w:type="dxa" w:w="80"/>
+              <w:right w:type="dxa" w:w="120"/>
+            </w:tcMar>
+            <w:vAlign w:val="center"/>
+          </w:tcPr>
+          <w:p>
+            <w:r>
+              <w:rPr>
+                <w:rFonts w:ascii="Arial" w:cs="Arial" w:eastAsia="Arial" w:hAnsi="Arial"/>
+                <w:b w:val="false"/>
+                <w:bCs w:val="false"/>
+                <w:color w:val="333333"/>
+                <w:sz w:val="20"/>
+                <w:szCs w:val="20"/>
+              </w:rPr>
+              <w:t xml:space="preserve">33% 단축</w:t>
+            </w:r>
+          </w:p>
+        </w:tc>
+      </w:tr>
+      <w:tr>
+        <w:tc>
+          <w:tcPr>
+            <w:tcW w:type="dxa" w:w="2340"/>
+            <w:tcBorders>
+              <w:top w:val="single" w:color="CCCCCC" w:sz="1"/>
+              <w:left w:val="single" w:color="CCCCCC" w:sz="1"/>
+              <w:bottom w:val="single" w:color="CCCCCC" w:sz="1"/>
+              <w:right w:val="single" w:color="CCCCCC" w:sz="1"/>
+            </w:tcBorders>
+            <w:shd w:fill="F5F5F5" w:val="clear"/>
+            <w:tcMar>
+              <w:top w:type="dxa" w:w="80"/>
+              <w:left w:type="dxa" w:w="120"/>
+              <w:bottom w:type="dxa" w:w="80"/>
+              <w:right w:type="dxa" w:w="120"/>
+            </w:tcMar>
+            <w:vAlign w:val="center"/>
+          </w:tcPr>
+          <w:p>
+            <w:r>
+              <w:rPr>
+                <w:rFonts w:ascii="Arial" w:cs="Arial" w:eastAsia="Arial" w:hAnsi="Arial"/>
+                <w:b/>
+                <w:bCs/>
+                <w:color w:val="333333"/>
+                <w:sz w:val="20"/>
+                <w:szCs w:val="20"/>
+              </w:rPr>
+              <w:t xml:space="preserve">첫 출시</w:t>
+            </w:r>
+          </w:p>
+        </w:tc>
+        <w:tc>
+          <w:tcPr>
+            <w:tcW w:type="dxa" w:w="2340"/>
+            <w:tcBorders>
+              <w:top w:val="single" w:color="CCCCCC" w:sz="1"/>
+              <w:left w:val="single" w:color="CCCCCC" w:sz="1"/>
+              <w:bottom w:val="single" w:color="CCCCCC" w:sz="1"/>
+              <w:right w:val="single" w:color="CCCCCC" w:sz="1"/>
+            </w:tcBorders>
+            <w:shd w:fill="FFFFFF" w:val="clear"/>
+            <w:tcMar>
+              <w:top w:type="dxa" w:w="80"/>
+              <w:left w:type="dxa" w:w="120"/>
+              <w:bottom w:type="dxa" w:w="80"/>
+              <w:right w:type="dxa" w:w="120"/>
+            </w:tcMar>
+            <w:vAlign w:val="center"/>
+          </w:tcPr>
+          <w:p>
+            <w:r>
+              <w:rPr>
+                <w:rFonts w:ascii="Arial" w:cs="Arial" w:eastAsia="Arial" w:hAnsi="Arial"/>
+                <w:b w:val="false"/>
+                <w:bCs w:val="false"/>
+                <w:color w:val="333333"/>
+                <w:sz w:val="20"/>
+                <w:szCs w:val="20"/>
+              </w:rPr>
+              <w:t xml:space="preserve">Week 10</w:t>
+            </w:r>
+          </w:p>
+        </w:tc>
+        <w:tc>
+          <w:tcPr>
+            <w:tcW w:type="dxa" w:w="2340"/>
+            <w:tcBorders>
+              <w:top w:val="single" w:color="CCCCCC" w:sz="1"/>
+              <w:left w:val="single" w:color="CCCCCC" w:sz="1"/>
+              <w:bottom w:val="single" w:color="CCCCCC" w:sz="1"/>
+              <w:right w:val="single" w:color="CCCCCC" w:sz="1"/>
+            </w:tcBorders>
+            <w:shd w:fill="FFFFFF" w:val="clear"/>
+            <w:tcMar>
+              <w:top w:type="dxa" w:w="80"/>
+              <w:left w:type="dxa" w:w="120"/>
+              <w:bottom w:type="dxa" w:w="80"/>
+              <w:right w:type="dxa" w:w="120"/>
+            </w:tcMar>
+            <w:vAlign w:val="center"/>
+          </w:tcPr>
+          <w:p>
+            <w:r>
+              <w:rPr>
+                <w:rFonts w:ascii="Arial" w:cs="Arial" w:eastAsia="Arial" w:hAnsi="Arial"/>
+                <w:b w:val="false"/>
+                <w:bCs w:val="false"/>
+                <w:color w:val="333333"/>
+                <w:sz w:val="20"/>
+                <w:szCs w:val="20"/>
+              </w:rPr>
+              <w:t xml:space="preserve">Week 7</w:t>
+            </w:r>
+          </w:p>
+        </w:tc>
+        <w:tc>
+          <w:tcPr>
+            <w:tcW w:type="dxa" w:w="2340"/>
+            <w:tcBorders>
+              <w:top w:val="single" w:color="CCCCCC" w:sz="1"/>
+              <w:left w:val="single" w:color="CCCCCC" w:sz="1"/>
+              <w:bottom w:val="single" w:color="CCCCCC" w:sz="1"/>
+              <w:right w:val="single" w:color="CCCCCC" w:sz="1"/>
+            </w:tcBorders>
+            <w:shd w:fill="FFFFFF" w:val="clear"/>
+            <w:tcMar>
+              <w:top w:type="dxa" w:w="80"/>
+              <w:left w:type="dxa" w:w="120"/>
+              <w:bottom w:type="dxa" w:w="80"/>
+              <w:right w:type="dxa" w:w="120"/>
+            </w:tcMar>
+            <w:vAlign w:val="center"/>
+          </w:tcPr>
+          <w:p>
+            <w:r>
+              <w:rPr>
+                <w:rFonts w:ascii="Arial" w:cs="Arial" w:eastAsia="Arial" w:hAnsi="Arial"/>
+                <w:b w:val="false"/>
+                <w:bCs w:val="false"/>
+                <w:color w:val="333333"/>
+                <w:sz w:val="20"/>
+                <w:szCs w:val="20"/>
+              </w:rPr>
+              <w:t xml:space="preserve">3주 빠름</w:t>
+            </w:r>
+          </w:p>
+        </w:tc>
+      </w:tr>
+      <w:tr>
+        <w:tc>
+          <w:tcPr>
+            <w:tcW w:type="dxa" w:w="2340"/>
+            <w:tcBorders>
+              <w:top w:val="single" w:color="CCCCCC" w:sz="1"/>
+              <w:left w:val="single" w:color="CCCCCC" w:sz="1"/>
+              <w:bottom w:val="single" w:color="CCCCCC" w:sz="1"/>
+              <w:right w:val="single" w:color="CCCCCC" w:sz="1"/>
+            </w:tcBorders>
+            <w:shd w:fill="F5F5F5" w:val="clear"/>
+            <w:tcMar>
+              <w:top w:type="dxa" w:w="80"/>
+              <w:left w:type="dxa" w:w="120"/>
+              <w:bottom w:type="dxa" w:w="80"/>
+              <w:right w:type="dxa" w:w="120"/>
+            </w:tcMar>
+            <w:vAlign w:val="center"/>
+          </w:tcPr>
+          <w:p>
+            <w:r>
+              <w:rPr>
+                <w:rFonts w:ascii="Arial" w:cs="Arial" w:eastAsia="Arial" w:hAnsi="Arial"/>
+                <w:b/>
+                <w:bCs/>
+                <w:color w:val="333333"/>
+                <w:sz w:val="20"/>
+                <w:szCs w:val="20"/>
+              </w:rPr>
+              <w:t xml:space="preserve">스프린트 1회</w:t>
+            </w:r>
+          </w:p>
+        </w:tc>
+        <w:tc>
+          <w:tcPr>
+            <w:tcW w:type="dxa" w:w="2340"/>
+            <w:tcBorders>
+              <w:top w:val="single" w:color="CCCCCC" w:sz="1"/>
+              <w:left w:val="single" w:color="CCCCCC" w:sz="1"/>
+              <w:bottom w:val="single" w:color="CCCCCC" w:sz="1"/>
+              <w:right w:val="single" w:color="CCCCCC" w:sz="1"/>
+            </w:tcBorders>
+            <w:shd w:fill="FFFFFF" w:val="clear"/>
+            <w:tcMar>
+              <w:top w:type="dxa" w:w="80"/>
+              <w:left w:type="dxa" w:w="120"/>
+              <w:bottom w:type="dxa" w:w="80"/>
+              <w:right w:type="dxa" w:w="120"/>
+            </w:tcMar>
+            <w:vAlign w:val="center"/>
+          </w:tcPr>
+          <w:p>
+            <w:r>
+              <w:rPr>
+                <w:rFonts w:ascii="Arial" w:cs="Arial" w:eastAsia="Arial" w:hAnsi="Arial"/>
+                <w:b w:val="false"/>
+                <w:bCs w:val="false"/>
+                <w:color w:val="333333"/>
+                <w:sz w:val="20"/>
+                <w:szCs w:val="20"/>
+              </w:rPr>
+              <w:t xml:space="preserve">10일</w:t>
+            </w:r>
+          </w:p>
+        </w:tc>
+        <w:tc>
+          <w:tcPr>
+            <w:tcW w:type="dxa" w:w="2340"/>
+            <w:tcBorders>
+              <w:top w:val="single" w:color="CCCCCC" w:sz="1"/>
+              <w:left w:val="single" w:color="CCCCCC" w:sz="1"/>
+              <w:bottom w:val="single" w:color="CCCCCC" w:sz="1"/>
+              <w:right w:val="single" w:color="CCCCCC" w:sz="1"/>
+            </w:tcBorders>
+            <w:shd w:fill="FFFFFF" w:val="clear"/>
+            <w:tcMar>
+              <w:top w:type="dxa" w:w="80"/>
+              <w:left w:type="dxa" w:w="120"/>
+              <w:bottom w:type="dxa" w:w="80"/>
+              <w:right w:type="dxa" w:w="120"/>
+            </w:tcMar>
+            <w:vAlign w:val="center"/>
+          </w:tcPr>
+          <w:p>
+            <w:r>
+              <w:rPr>
+                <w:rFonts w:ascii="Arial" w:cs="Arial" w:eastAsia="Arial" w:hAnsi="Arial"/>
+                <w:b w:val="false"/>
+                <w:bCs w:val="false"/>
+                <w:color w:val="333333"/>
+                <w:sz w:val="20"/>
+                <w:szCs w:val="20"/>
+              </w:rPr>
+              <w:t xml:space="preserve">4일</w:t>
+            </w:r>
+          </w:p>
+        </w:tc>
+        <w:tc>
+          <w:tcPr>
+            <w:tcW w:type="dxa" w:w="2340"/>
+            <w:tcBorders>
+              <w:top w:val="single" w:color="CCCCCC" w:sz="1"/>
+              <w:left w:val="single" w:color="CCCCCC" w:sz="1"/>
+              <w:bottom w:val="single" w:color="CCCCCC" w:sz="1"/>
+              <w:right w:val="single" w:color="CCCCCC" w:sz="1"/>
+            </w:tcBorders>
+            <w:shd w:fill="FFFFFF" w:val="clear"/>
+            <w:tcMar>
+              <w:top w:type="dxa" w:w="80"/>
+              <w:left w:type="dxa" w:w="120"/>
+              <w:bottom w:type="dxa" w:w="80"/>
+              <w:right w:type="dxa" w:w="120"/>
+            </w:tcMar>
+            <w:vAlign w:val="center"/>
+          </w:tcPr>
+          <w:p>
+            <w:r>
+              <w:rPr>
+                <w:rFonts w:ascii="Arial" w:cs="Arial" w:eastAsia="Arial" w:hAnsi="Arial"/>
+                <w:b w:val="false"/>
+                <w:bCs w:val="false"/>
+                <w:color w:val="333333"/>
+                <w:sz w:val="20"/>
+                <w:szCs w:val="20"/>
+              </w:rPr>
+              <w:t xml:space="preserve">60% 단축</w:t>
+            </w:r>
+          </w:p>
+        </w:tc>
+      </w:tr>
+      <w:tr>
+        <w:tc>
+          <w:tcPr>
+            <w:tcW w:type="dxa" w:w="2340"/>
+            <w:tcBorders>
+              <w:top w:val="single" w:color="CCCCCC" w:sz="1"/>
+              <w:left w:val="single" w:color="CCCCCC" w:sz="1"/>
+              <w:bottom w:val="single" w:color="CCCCCC" w:sz="1"/>
+              <w:right w:val="single" w:color="CCCCCC" w:sz="1"/>
+            </w:tcBorders>
+            <w:shd w:fill="F5F5F5" w:val="clear"/>
+            <w:tcMar>
+              <w:top w:type="dxa" w:w="80"/>
+              <w:left w:type="dxa" w:w="120"/>
+              <w:bottom w:type="dxa" w:w="80"/>
+              <w:right w:type="dxa" w:w="120"/>
+            </w:tcMar>
+            <w:vAlign w:val="center"/>
+          </w:tcPr>
+          <w:p>
+            <w:r>
+              <w:rPr>
+                <w:rFonts w:ascii="Arial" w:cs="Arial" w:eastAsia="Arial" w:hAnsi="Arial"/>
+                <w:b/>
+                <w:bCs/>
+                <w:color w:val="333333"/>
+                <w:sz w:val="20"/>
+                <w:szCs w:val="20"/>
+              </w:rPr>
+              <w:t xml:space="preserve">QA 시간</w:t>
+            </w:r>
+          </w:p>
+        </w:tc>
+        <w:tc>
+          <w:tcPr>
+            <w:tcW w:type="dxa" w:w="2340"/>
+            <w:tcBorders>
+              <w:top w:val="single" w:color="CCCCCC" w:sz="1"/>
+              <w:left w:val="single" w:color="CCCCCC" w:sz="1"/>
+              <w:bottom w:val="single" w:color="CCCCCC" w:sz="1"/>
+              <w:right w:val="single" w:color="CCCCCC" w:sz="1"/>
+            </w:tcBorders>
+            <w:shd w:fill="FFFFFF" w:val="clear"/>
+            <w:tcMar>
+              <w:top w:type="dxa" w:w="80"/>
+              <w:left w:type="dxa" w:w="120"/>
+              <w:bottom w:type="dxa" w:w="80"/>
+              <w:right w:type="dxa" w:w="120"/>
+            </w:tcMar>
+            <w:vAlign w:val="center"/>
+          </w:tcPr>
+          <w:p>
+            <w:r>
+              <w:rPr>
+                <w:rFonts w:ascii="Arial" w:cs="Arial" w:eastAsia="Arial" w:hAnsi="Arial"/>
+                <w:b w:val="false"/>
+                <w:bCs w:val="false"/>
+                <w:color w:val="333333"/>
+                <w:sz w:val="20"/>
+                <w:szCs w:val="20"/>
+              </w:rPr>
+              <w:t xml:space="preserve">2일 (수동)</w:t>
+            </w:r>
+          </w:p>
+        </w:tc>
+        <w:tc>
+          <w:tcPr>
+            <w:tcW w:type="dxa" w:w="2340"/>
+            <w:tcBorders>
+              <w:top w:val="single" w:color="CCCCCC" w:sz="1"/>
+              <w:left w:val="single" w:color="CCCCCC" w:sz="1"/>
+              <w:bottom w:val="single" w:color="CCCCCC" w:sz="1"/>
+              <w:right w:val="single" w:color="CCCCCC" w:sz="1"/>
+            </w:tcBorders>
+            <w:shd w:fill="FFFFFF" w:val="clear"/>
+            <w:tcMar>
+              <w:top w:type="dxa" w:w="80"/>
+              <w:left w:type="dxa" w:w="120"/>
+              <w:bottom w:type="dxa" w:w="80"/>
+              <w:right w:type="dxa" w:w="120"/>
+            </w:tcMar>
+            <w:vAlign w:val="center"/>
+          </w:tcPr>
+          <w:p>
+            <w:r>
+              <w:rPr>
+                <w:rFonts w:ascii="Arial" w:cs="Arial" w:eastAsia="Arial" w:hAnsi="Arial"/>
+                <w:b w:val="false"/>
+                <w:bCs w:val="false"/>
+                <w:color w:val="333333"/>
+                <w:sz w:val="20"/>
+                <w:szCs w:val="20"/>
+              </w:rPr>
+              <w:t xml:space="preserve">0.5일 (자동)</w:t>
+            </w:r>
+          </w:p>
+        </w:tc>
+        <w:tc>
+          <w:tcPr>
+            <w:tcW w:type="dxa" w:w="2340"/>
+            <w:tcBorders>
+              <w:top w:val="single" w:color="CCCCCC" w:sz="1"/>
+              <w:left w:val="single" w:color="CCCCCC" w:sz="1"/>
+              <w:bottom w:val="single" w:color="CCCCCC" w:sz="1"/>
+              <w:right w:val="single" w:color="CCCCCC" w:sz="1"/>
+            </w:tcBorders>
+            <w:shd w:fill="FFFFFF" w:val="clear"/>
+            <w:tcMar>
+              <w:top w:type="dxa" w:w="80"/>
+              <w:left w:type="dxa" w:w="120"/>
+              <w:bottom w:type="dxa" w:w="80"/>
+              <w:right w:type="dxa" w:w="120"/>
+            </w:tcMar>
+            <w:vAlign w:val="center"/>
+          </w:tcPr>
+          <w:p>
+            <w:r>
+              <w:rPr>
+                <w:rFonts w:ascii="Arial" w:cs="Arial" w:eastAsia="Arial" w:hAnsi="Arial"/>
+                <w:b w:val="false"/>
+                <w:bCs w:val="false"/>
+                <w:color w:val="333333"/>
+                <w:sz w:val="20"/>
+                <w:szCs w:val="20"/>
+              </w:rPr>
+              <w:t xml:space="preserve">75% 단축</w:t>
+            </w:r>
+          </w:p>
+        </w:tc>
+      </w:tr>
+      <w:tr>
+        <w:tc>
+          <w:tcPr>
+            <w:tcW w:type="dxa" w:w="2340"/>
+            <w:tcBorders>
+              <w:top w:val="single" w:color="CCCCCC" w:sz="1"/>
+              <w:left w:val="single" w:color="CCCCCC" w:sz="1"/>
+              <w:bottom w:val="single" w:color="CCCCCC" w:sz="1"/>
+              <w:right w:val="single" w:color="CCCCCC" w:sz="1"/>
+            </w:tcBorders>
+            <w:shd w:fill="F5F5F5" w:val="clear"/>
+            <w:tcMar>
+              <w:top w:type="dxa" w:w="80"/>
+              <w:left w:type="dxa" w:w="120"/>
+              <w:bottom w:type="dxa" w:w="80"/>
+              <w:right w:type="dxa" w:w="120"/>
+            </w:tcMar>
+            <w:vAlign w:val="center"/>
+          </w:tcPr>
+          <w:p>
+            <w:r>
+              <w:rPr>
+                <w:rFonts w:ascii="Arial" w:cs="Arial" w:eastAsia="Arial" w:hAnsi="Arial"/>
+                <w:b/>
+                <w:bCs/>
+                <w:color w:val="333333"/>
+                <w:sz w:val="20"/>
+                <w:szCs w:val="20"/>
+              </w:rPr>
+              <w:t xml:space="preserve">코드 리뷰</w:t>
+            </w:r>
+          </w:p>
+        </w:tc>
+        <w:tc>
+          <w:tcPr>
+            <w:tcW w:type="dxa" w:w="2340"/>
+            <w:tcBorders>
+              <w:top w:val="single" w:color="CCCCCC" w:sz="1"/>
+              <w:left w:val="single" w:color="CCCCCC" w:sz="1"/>
+              <w:bottom w:val="single" w:color="CCCCCC" w:sz="1"/>
+              <w:right w:val="single" w:color="CCCCCC" w:sz="1"/>
+            </w:tcBorders>
+            <w:shd w:fill="FFFFFF" w:val="clear"/>
+            <w:tcMar>
+              <w:top w:type="dxa" w:w="80"/>
+              <w:left w:type="dxa" w:w="120"/>
+              <w:bottom w:type="dxa" w:w="80"/>
+              <w:right w:type="dxa" w:w="120"/>
+            </w:tcMar>
+            <w:vAlign w:val="center"/>
+          </w:tcPr>
+          <w:p>
+            <w:r>
+              <w:rPr>
+                <w:rFonts w:ascii="Arial" w:cs="Arial" w:eastAsia="Arial" w:hAnsi="Arial"/>
+                <w:b w:val="false"/>
+                <w:bCs w:val="false"/>
+                <w:color w:val="333333"/>
+                <w:sz w:val="20"/>
+                <w:szCs w:val="20"/>
+              </w:rPr>
+              <w:t xml:space="preserve">대표 직접</w:t>
+            </w:r>
+          </w:p>
+        </w:tc>
+        <w:tc>
+          <w:tcPr>
+            <w:tcW w:type="dxa" w:w="2340"/>
+            <w:tcBorders>
+              <w:top w:val="single" w:color="CCCCCC" w:sz="1"/>
+              <w:left w:val="single" w:color="CCCCCC" w:sz="1"/>
+              <w:bottom w:val="single" w:color="CCCCCC" w:sz="1"/>
+              <w:right w:val="single" w:color="CCCCCC" w:sz="1"/>
+            </w:tcBorders>
+            <w:shd w:fill="FFFFFF" w:val="clear"/>
+            <w:tcMar>
+              <w:top w:type="dxa" w:w="80"/>
+              <w:left w:type="dxa" w:w="120"/>
+              <w:bottom w:type="dxa" w:w="80"/>
+              <w:right w:type="dxa" w:w="120"/>
+            </w:tcMar>
+            <w:vAlign w:val="center"/>
+          </w:tcPr>
+          <w:p>
+            <w:r>
+              <w:rPr>
+                <w:rFonts w:ascii="Arial" w:cs="Arial" w:eastAsia="Arial" w:hAnsi="Arial"/>
+                <w:b w:val="false"/>
+                <w:bCs w:val="false"/>
+                <w:color w:val="333333"/>
+                <w:sz w:val="20"/>
+                <w:szCs w:val="20"/>
+              </w:rPr>
+              <w:t xml:space="preserve">16개 에이전트 자동</w:t>
+            </w:r>
+          </w:p>
+        </w:tc>
+        <w:tc>
+          <w:tcPr>
+            <w:tcW w:type="dxa" w:w="2340"/>
+            <w:tcBorders>
+              <w:top w:val="single" w:color="CCCCCC" w:sz="1"/>
+              <w:left w:val="single" w:color="CCCCCC" w:sz="1"/>
+              <w:bottom w:val="single" w:color="CCCCCC" w:sz="1"/>
+              <w:right w:val="single" w:color="CCCCCC" w:sz="1"/>
+            </w:tcBorders>
+            <w:shd w:fill="FFFFFF" w:val="clear"/>
+            <w:tcMar>
+              <w:top w:type="dxa" w:w="80"/>
+              <w:left w:type="dxa" w:w="120"/>
+              <w:bottom w:type="dxa" w:w="80"/>
+              <w:right w:type="dxa" w:w="120"/>
+            </w:tcMar>
+            <w:vAlign w:val="center"/>
+          </w:tcPr>
+          <w:p>
+            <w:r>
+              <w:rPr>
+                <w:rFonts w:ascii="Arial" w:cs="Arial" w:eastAsia="Arial" w:hAnsi="Arial"/>
+                <w:b w:val="false"/>
+                <w:bCs w:val="false"/>
+                <w:color w:val="333333"/>
+                <w:sz w:val="20"/>
+                <w:szCs w:val="20"/>
+              </w:rPr>
+              <w:t xml:space="preserve">84% 발견율</w:t>
+            </w:r>
+          </w:p>
+        </w:tc>
+      </w:tr>
+    </w:tbl>
+    <w:p>
+      <w:pPr>
+        <w:spacing w:after="100" w:before="100"/>
+      </w:pPr>
+    </w:p>
+    <w:p>
+      <w:pPr>
+        <w:spacing w:after="100" w:before="200"/>
+      </w:pPr>
+      <w:r>
+        <w:rPr>
+          <w:rFonts w:ascii="Arial" w:cs="Arial" w:eastAsia="Arial" w:hAnsi="Arial"/>
+          <w:b/>
+          <w:bCs/>
+          <w:color w:val="0066CC"/>
+          <w:sz w:val="24"/>
+          <w:szCs w:val="24"/>
+        </w:rPr>
+        <w:t xml:space="preserve">대표님 역할 변화</w:t>
+      </w:r>
+    </w:p>
+    <w:tbl>
+      <w:tblPr>
+        <w:tblW w:type="dxa" w:w="9360"/>
+        <w:tblBorders>
+          <w:top w:val="single" w:color="auto" w:sz="4"/>
+          <w:left w:val="single" w:color="auto" w:sz="4"/>
+          <w:bottom w:val="single" w:color="auto" w:sz="4"/>
+          <w:right w:val="single" w:color="auto" w:sz="4"/>
+          <w:insideH w:val="single" w:color="auto" w:sz="4"/>
+          <w:insideV w:val="single" w:color="auto" w:sz="4"/>
+        </w:tblBorders>
+      </w:tblPr>
+      <w:tblGrid>
+        <w:gridCol w:w="3120"/>
+        <w:gridCol w:w="3120"/>
+        <w:gridCol w:w="3120"/>
+      </w:tblGrid>
+      <w:tr>
+        <w:tc>
+          <w:tcPr>
+            <w:tcW w:type="dxa" w:w="3120"/>
+            <w:tcBorders>
+              <w:top w:val="single" w:color="CCCCCC" w:sz="1"/>
+              <w:left w:val="single" w:color="CCCCCC" w:sz="1"/>
+              <w:bottom w:val="single" w:color="CCCCCC" w:sz="1"/>
+              <w:right w:val="single" w:color="CCCCCC" w:sz="1"/>
+            </w:tcBorders>
+            <w:shd w:fill="003366" w:val="clear"/>
+            <w:tcMar>
+              <w:top w:type="dxa" w:w="80"/>
+              <w:left w:type="dxa" w:w="120"/>
+              <w:bottom w:type="dxa" w:w="80"/>
+              <w:right w:type="dxa" w:w="120"/>
+            </w:tcMar>
+            <w:vAlign w:val="center"/>
+          </w:tcPr>
+          <w:p>
+            <w:r>
+              <w:rPr>
+                <w:rFonts w:ascii="Arial" w:cs="Arial" w:eastAsia="Arial" w:hAnsi="Arial"/>
+                <w:b/>
+                <w:bCs/>
+                <w:color w:val="FFFFFF"/>
+                <w:sz w:val="20"/>
+                <w:szCs w:val="20"/>
+              </w:rPr>
+              <w:t xml:space="preserve">업무</w:t>
+            </w:r>
+          </w:p>
+        </w:tc>
+        <w:tc>
+          <w:tcPr>
+            <w:tcW w:type="dxa" w:w="3120"/>
+            <w:tcBorders>
+              <w:top w:val="single" w:color="CCCCCC" w:sz="1"/>
+              <w:left w:val="single" w:color="CCCCCC" w:sz="1"/>
+              <w:bottom w:val="single" w:color="CCCCCC" w:sz="1"/>
+              <w:right w:val="single" w:color="CCCCCC" w:sz="1"/>
+            </w:tcBorders>
+            <w:shd w:fill="003366" w:val="clear"/>
+            <w:tcMar>
+              <w:top w:type="dxa" w:w="80"/>
+              <w:left w:type="dxa" w:w="120"/>
+              <w:bottom w:type="dxa" w:w="80"/>
+              <w:right w:type="dxa" w:w="120"/>
+            </w:tcMar>
+            <w:vAlign w:val="center"/>
+          </w:tcPr>
+          <w:p>
+            <w:r>
+              <w:rPr>
+                <w:rFonts w:ascii="Arial" w:cs="Arial" w:eastAsia="Arial" w:hAnsi="Arial"/>
+                <w:b/>
+                <w:bCs/>
+                <w:color w:val="FFFFFF"/>
+                <w:sz w:val="20"/>
+                <w:szCs w:val="20"/>
+              </w:rPr>
+              <w:t xml:space="preserve">이전</w:t>
+            </w:r>
+          </w:p>
+        </w:tc>
+        <w:tc>
+          <w:tcPr>
+            <w:tcW w:type="dxa" w:w="3120"/>
+            <w:tcBorders>
+              <w:top w:val="single" w:color="CCCCCC" w:sz="1"/>
+              <w:left w:val="single" w:color="CCCCCC" w:sz="1"/>
+              <w:bottom w:val="single" w:color="CCCCCC" w:sz="1"/>
+              <w:right w:val="single" w:color="CCCCCC" w:sz="1"/>
+            </w:tcBorders>
+            <w:shd w:fill="003366" w:val="clear"/>
+            <w:tcMar>
+              <w:top w:type="dxa" w:w="80"/>
+              <w:left w:type="dxa" w:w="120"/>
+              <w:bottom w:type="dxa" w:w="80"/>
+              <w:right w:type="dxa" w:w="120"/>
+            </w:tcMar>
+            <w:vAlign w:val="center"/>
+          </w:tcPr>
+          <w:p>
+            <w:r>
+              <w:rPr>
+                <w:rFonts w:ascii="Arial" w:cs="Arial" w:eastAsia="Arial" w:hAnsi="Arial"/>
+                <w:b/>
+                <w:bCs/>
+                <w:color w:val="FFFFFF"/>
+                <w:sz w:val="20"/>
+                <w:szCs w:val="20"/>
+              </w:rPr>
+              <w:t xml:space="preserve">이후</w:t>
+            </w:r>
+          </w:p>
+        </w:tc>
+      </w:tr>
+      <w:tr>
+        <w:tc>
+          <w:tcPr>
+            <w:tcW w:type="dxa" w:w="3120"/>
+            <w:tcBorders>
+              <w:top w:val="single" w:color="CCCCCC" w:sz="1"/>
+              <w:left w:val="single" w:color="CCCCCC" w:sz="1"/>
+              <w:bottom w:val="single" w:color="CCCCCC" w:sz="1"/>
+              <w:right w:val="single" w:color="CCCCCC" w:sz="1"/>
+            </w:tcBorders>
+            <w:shd w:fill="F5F5F5" w:val="clear"/>
+            <w:tcMar>
+              <w:top w:type="dxa" w:w="80"/>
+              <w:left w:type="dxa" w:w="120"/>
+              <w:bottom w:type="dxa" w:w="80"/>
+              <w:right w:type="dxa" w:w="120"/>
+            </w:tcMar>
+            <w:vAlign w:val="center"/>
+          </w:tcPr>
+          <w:p>
+            <w:r>
+              <w:rPr>
+                <w:rFonts w:ascii="Arial" w:cs="Arial" w:eastAsia="Arial" w:hAnsi="Arial"/>
+                <w:b/>
+                <w:bCs/>
+                <w:color w:val="333333"/>
+                <w:sz w:val="20"/>
+                <w:szCs w:val="20"/>
+              </w:rPr>
+              <w:t xml:space="preserve">코딩</w:t>
+            </w:r>
+          </w:p>
+        </w:tc>
+        <w:tc>
+          <w:tcPr>
+            <w:tcW w:type="dxa" w:w="3120"/>
+            <w:tcBorders>
+              <w:top w:val="single" w:color="CCCCCC" w:sz="1"/>
+              <w:left w:val="single" w:color="CCCCCC" w:sz="1"/>
+              <w:bottom w:val="single" w:color="CCCCCC" w:sz="1"/>
+              <w:right w:val="single" w:color="CCCCCC" w:sz="1"/>
+            </w:tcBorders>
+            <w:shd w:fill="FFFFFF" w:val="clear"/>
+            <w:tcMar>
+              <w:top w:type="dxa" w:w="80"/>
+              <w:left w:type="dxa" w:w="120"/>
+              <w:bottom w:type="dxa" w:w="80"/>
+              <w:right w:type="dxa" w:w="120"/>
+            </w:tcMar>
+            <w:vAlign w:val="center"/>
+          </w:tcPr>
+          <w:p>
+            <w:r>
+              <w:rPr>
+                <w:rFonts w:ascii="Arial" w:cs="Arial" w:eastAsia="Arial" w:hAnsi="Arial"/>
+                <w:b w:val="false"/>
+                <w:bCs w:val="false"/>
+                <w:color w:val="333333"/>
+                <w:sz w:val="20"/>
+                <w:szCs w:val="20"/>
+              </w:rPr>
+              <w:t xml:space="preserve">직접 지시+확인</w:t>
+            </w:r>
+          </w:p>
+        </w:tc>
+        <w:tc>
+          <w:tcPr>
+            <w:tcW w:type="dxa" w:w="3120"/>
+            <w:tcBorders>
+              <w:top w:val="single" w:color="CCCCCC" w:sz="1"/>
+              <w:left w:val="single" w:color="CCCCCC" w:sz="1"/>
+              <w:bottom w:val="single" w:color="CCCCCC" w:sz="1"/>
+              <w:right w:val="single" w:color="CCCCCC" w:sz="1"/>
+            </w:tcBorders>
+            <w:shd w:fill="FFFFFF" w:val="clear"/>
+            <w:tcMar>
+              <w:top w:type="dxa" w:w="80"/>
+              <w:left w:type="dxa" w:w="120"/>
+              <w:bottom w:type="dxa" w:w="80"/>
+              <w:right w:type="dxa" w:w="120"/>
+            </w:tcMar>
+            <w:vAlign w:val="center"/>
+          </w:tcPr>
+          <w:p>
+            <w:r>
+              <w:rPr>
+                <w:rFonts w:ascii="Arial" w:cs="Arial" w:eastAsia="Arial" w:hAnsi="Arial"/>
+                <w:b w:val="false"/>
+                <w:bCs w:val="false"/>
+                <w:color w:val="333333"/>
+                <w:sz w:val="20"/>
+                <w:szCs w:val="20"/>
+              </w:rPr>
+              <w:t xml:space="preserve">결과만 확인</w:t>
+            </w:r>
+          </w:p>
+        </w:tc>
+      </w:tr>
+      <w:tr>
+        <w:tc>
+          <w:tcPr>
+            <w:tcW w:type="dxa" w:w="3120"/>
+            <w:tcBorders>
+              <w:top w:val="single" w:color="CCCCCC" w:sz="1"/>
+              <w:left w:val="single" w:color="CCCCCC" w:sz="1"/>
+              <w:bottom w:val="single" w:color="CCCCCC" w:sz="1"/>
+              <w:right w:val="single" w:color="CCCCCC" w:sz="1"/>
+            </w:tcBorders>
+            <w:shd w:fill="F5F5F5" w:val="clear"/>
+            <w:tcMar>
+              <w:top w:type="dxa" w:w="80"/>
+              <w:left w:type="dxa" w:w="120"/>
+              <w:bottom w:type="dxa" w:w="80"/>
+              <w:right w:type="dxa" w:w="120"/>
+            </w:tcMar>
+            <w:vAlign w:val="center"/>
+          </w:tcPr>
+          <w:p>
+            <w:r>
+              <w:rPr>
+                <w:rFonts w:ascii="Arial" w:cs="Arial" w:eastAsia="Arial" w:hAnsi="Arial"/>
+                <w:b/>
+                <w:bCs/>
+                <w:color w:val="333333"/>
+                <w:sz w:val="20"/>
+                <w:szCs w:val="20"/>
+              </w:rPr>
+              <w:t xml:space="preserve">설계</w:t>
+            </w:r>
+          </w:p>
+        </w:tc>
+        <w:tc>
+          <w:tcPr>
+            <w:tcW w:type="dxa" w:w="3120"/>
+            <w:tcBorders>
+              <w:top w:val="single" w:color="CCCCCC" w:sz="1"/>
+              <w:left w:val="single" w:color="CCCCCC" w:sz="1"/>
+              <w:bottom w:val="single" w:color="CCCCCC" w:sz="1"/>
+              <w:right w:val="single" w:color="CCCCCC" w:sz="1"/>
+            </w:tcBorders>
+            <w:shd w:fill="FFFFFF" w:val="clear"/>
+            <w:tcMar>
+              <w:top w:type="dxa" w:w="80"/>
+              <w:left w:type="dxa" w:w="120"/>
+              <w:bottom w:type="dxa" w:w="80"/>
+              <w:right w:type="dxa" w:w="120"/>
+            </w:tcMar>
+            <w:vAlign w:val="center"/>
+          </w:tcPr>
+          <w:p>
+            <w:r>
+              <w:rPr>
+                <w:rFonts w:ascii="Arial" w:cs="Arial" w:eastAsia="Arial" w:hAnsi="Arial"/>
+                <w:b w:val="false"/>
+                <w:bCs w:val="false"/>
+                <w:color w:val="333333"/>
+                <w:sz w:val="20"/>
+                <w:szCs w:val="20"/>
+              </w:rPr>
+              <w:t xml:space="preserve">직접 기획</w:t>
+            </w:r>
+          </w:p>
+        </w:tc>
+        <w:tc>
+          <w:tcPr>
+            <w:tcW w:type="dxa" w:w="3120"/>
+            <w:tcBorders>
+              <w:top w:val="single" w:color="CCCCCC" w:sz="1"/>
+              <w:left w:val="single" w:color="CCCCCC" w:sz="1"/>
+              <w:bottom w:val="single" w:color="CCCCCC" w:sz="1"/>
+              <w:right w:val="single" w:color="CCCCCC" w:sz="1"/>
+            </w:tcBorders>
+            <w:shd w:fill="FFFFFF" w:val="clear"/>
+            <w:tcMar>
+              <w:top w:type="dxa" w:w="80"/>
+              <w:left w:type="dxa" w:w="120"/>
+              <w:bottom w:type="dxa" w:w="80"/>
+              <w:right w:type="dxa" w:w="120"/>
+            </w:tcMar>
+            <w:vAlign w:val="center"/>
+          </w:tcPr>
+          <w:p>
+            <w:r>
+              <w:rPr>
+                <w:rFonts w:ascii="Arial" w:cs="Arial" w:eastAsia="Arial" w:hAnsi="Arial"/>
+                <w:b w:val="false"/>
+                <w:bCs w:val="false"/>
+                <w:color w:val="333333"/>
+                <w:sz w:val="20"/>
+                <w:szCs w:val="20"/>
+              </w:rPr>
+              <w:t xml:space="preserve">T2 산출물 승인 (15분)</w:t>
+            </w:r>
+          </w:p>
+        </w:tc>
+      </w:tr>
+      <w:tr>
+        <w:tc>
+          <w:tcPr>
+            <w:tcW w:type="dxa" w:w="3120"/>
+            <w:tcBorders>
+              <w:top w:val="single" w:color="CCCCCC" w:sz="1"/>
+              <w:left w:val="single" w:color="CCCCCC" w:sz="1"/>
+              <w:bottom w:val="single" w:color="CCCCCC" w:sz="1"/>
+              <w:right w:val="single" w:color="CCCCCC" w:sz="1"/>
+            </w:tcBorders>
+            <w:shd w:fill="F5F5F5" w:val="clear"/>
+            <w:tcMar>
+              <w:top w:type="dxa" w:w="80"/>
+              <w:left w:type="dxa" w:w="120"/>
+              <w:bottom w:type="dxa" w:w="80"/>
+              <w:right w:type="dxa" w:w="120"/>
+            </w:tcMar>
+            <w:vAlign w:val="center"/>
+          </w:tcPr>
+          <w:p>
+            <w:r>
+              <w:rPr>
+                <w:rFonts w:ascii="Arial" w:cs="Arial" w:eastAsia="Arial" w:hAnsi="Arial"/>
+                <w:b/>
+                <w:bCs/>
+                <w:color w:val="333333"/>
+                <w:sz w:val="20"/>
+                <w:szCs w:val="20"/>
+              </w:rPr>
+              <w:t xml:space="preserve">리뷰</w:t>
+            </w:r>
+          </w:p>
+        </w:tc>
+        <w:tc>
+          <w:tcPr>
+            <w:tcW w:type="dxa" w:w="3120"/>
+            <w:tcBorders>
+              <w:top w:val="single" w:color="CCCCCC" w:sz="1"/>
+              <w:left w:val="single" w:color="CCCCCC" w:sz="1"/>
+              <w:bottom w:val="single" w:color="CCCCCC" w:sz="1"/>
+              <w:right w:val="single" w:color="CCCCCC" w:sz="1"/>
+            </w:tcBorders>
+            <w:shd w:fill="FFFFFF" w:val="clear"/>
+            <w:tcMar>
+              <w:top w:type="dxa" w:w="80"/>
+              <w:left w:type="dxa" w:w="120"/>
+              <w:bottom w:type="dxa" w:w="80"/>
+              <w:right w:type="dxa" w:w="120"/>
+            </w:tcMar>
+            <w:vAlign w:val="center"/>
+          </w:tcPr>
+          <w:p>
+            <w:r>
+              <w:rPr>
+                <w:rFonts w:ascii="Arial" w:cs="Arial" w:eastAsia="Arial" w:hAnsi="Arial"/>
+                <w:b w:val="false"/>
+                <w:bCs w:val="false"/>
+                <w:color w:val="333333"/>
+                <w:sz w:val="20"/>
+                <w:szCs w:val="20"/>
+              </w:rPr>
+              <w:t xml:space="preserve">직접 읽기</w:t>
+            </w:r>
+          </w:p>
+        </w:tc>
+        <w:tc>
+          <w:tcPr>
+            <w:tcW w:type="dxa" w:w="3120"/>
+            <w:tcBorders>
+              <w:top w:val="single" w:color="CCCCCC" w:sz="1"/>
+              <w:left w:val="single" w:color="CCCCCC" w:sz="1"/>
+              <w:bottom w:val="single" w:color="CCCCCC" w:sz="1"/>
+              <w:right w:val="single" w:color="CCCCCC" w:sz="1"/>
+            </w:tcBorders>
+            <w:shd w:fill="FFFFFF" w:val="clear"/>
+            <w:tcMar>
+              <w:top w:type="dxa" w:w="80"/>
+              <w:left w:type="dxa" w:w="120"/>
+              <w:bottom w:type="dxa" w:w="80"/>
+              <w:right w:type="dxa" w:w="120"/>
+            </w:tcMar>
+            <w:vAlign w:val="center"/>
+          </w:tcPr>
+          <w:p>
+            <w:r>
+              <w:rPr>
+                <w:rFonts w:ascii="Arial" w:cs="Arial" w:eastAsia="Arial" w:hAnsi="Arial"/>
+                <w:b w:val="false"/>
+                <w:bCs w:val="false"/>
+                <w:color w:val="333333"/>
+                <w:sz w:val="20"/>
+                <w:szCs w:val="20"/>
+              </w:rPr>
+              <w:t xml:space="preserve">T4 요약 리포트 확인</w:t>
+            </w:r>
+          </w:p>
+        </w:tc>
+      </w:tr>
+      <w:tr>
+        <w:tc>
+          <w:tcPr>
+            <w:tcW w:type="dxa" w:w="3120"/>
+            <w:tcBorders>
+              <w:top w:val="single" w:color="CCCCCC" w:sz="1"/>
+              <w:left w:val="single" w:color="CCCCCC" w:sz="1"/>
+              <w:bottom w:val="single" w:color="CCCCCC" w:sz="1"/>
+              <w:right w:val="single" w:color="CCCCCC" w:sz="1"/>
+            </w:tcBorders>
+            <w:shd w:fill="F5F5F5" w:val="clear"/>
+            <w:tcMar>
+              <w:top w:type="dxa" w:w="80"/>
+              <w:left w:type="dxa" w:w="120"/>
+              <w:bottom w:type="dxa" w:w="80"/>
+              <w:right w:type="dxa" w:w="120"/>
+            </w:tcMar>
+            <w:vAlign w:val="center"/>
+          </w:tcPr>
+          <w:p>
+            <w:r>
+              <w:rPr>
+                <w:rFonts w:ascii="Arial" w:cs="Arial" w:eastAsia="Arial" w:hAnsi="Arial"/>
+                <w:b/>
+                <w:bCs/>
+                <w:color w:val="333333"/>
+                <w:sz w:val="20"/>
+                <w:szCs w:val="20"/>
+              </w:rPr>
+              <w:t xml:space="preserve">보안</w:t>
+            </w:r>
+          </w:p>
+        </w:tc>
+        <w:tc>
+          <w:tcPr>
+            <w:tcW w:type="dxa" w:w="3120"/>
+            <w:tcBorders>
+              <w:top w:val="single" w:color="CCCCCC" w:sz="1"/>
+              <w:left w:val="single" w:color="CCCCCC" w:sz="1"/>
+              <w:bottom w:val="single" w:color="CCCCCC" w:sz="1"/>
+              <w:right w:val="single" w:color="CCCCCC" w:sz="1"/>
+            </w:tcBorders>
+            <w:shd w:fill="FFFFFF" w:val="clear"/>
+            <w:tcMar>
+              <w:top w:type="dxa" w:w="80"/>
+              <w:left w:type="dxa" w:w="120"/>
+              <w:bottom w:type="dxa" w:w="80"/>
+              <w:right w:type="dxa" w:w="120"/>
+            </w:tcMar>
+            <w:vAlign w:val="center"/>
+          </w:tcPr>
+          <w:p>
+            <w:r>
+              <w:rPr>
+                <w:rFonts w:ascii="Arial" w:cs="Arial" w:eastAsia="Arial" w:hAnsi="Arial"/>
+                <w:b w:val="false"/>
+                <w:bCs w:val="false"/>
+                <w:color w:val="333333"/>
+                <w:sz w:val="20"/>
+                <w:szCs w:val="20"/>
+              </w:rPr>
+              <w:t xml:space="preserve">생략</w:t>
+            </w:r>
+          </w:p>
+        </w:tc>
+        <w:tc>
+          <w:tcPr>
+            <w:tcW w:type="dxa" w:w="3120"/>
+            <w:tcBorders>
+              <w:top w:val="single" w:color="CCCCCC" w:sz="1"/>
+              <w:left w:val="single" w:color="CCCCCC" w:sz="1"/>
+              <w:bottom w:val="single" w:color="CCCCCC" w:sz="1"/>
+              <w:right w:val="single" w:color="CCCCCC" w:sz="1"/>
+            </w:tcBorders>
+            <w:shd w:fill="FFFFFF" w:val="clear"/>
+            <w:tcMar>
+              <w:top w:type="dxa" w:w="80"/>
+              <w:left w:type="dxa" w:w="120"/>
+              <w:bottom w:type="dxa" w:w="80"/>
+              <w:right w:type="dxa" w:w="120"/>
+            </w:tcMar>
+            <w:vAlign w:val="center"/>
+          </w:tcPr>
+          <w:p>
+            <w:r>
+              <w:rPr>
+                <w:rFonts w:ascii="Arial" w:cs="Arial" w:eastAsia="Arial" w:hAnsi="Arial"/>
+                <w:b w:val="false"/>
+                <w:bCs w:val="false"/>
+                <w:color w:val="333333"/>
+                <w:sz w:val="20"/>
+                <w:szCs w:val="20"/>
+              </w:rPr>
+              <w:t xml:space="preserve">T6 자동 (CRITICAL 시만 보고)</w:t>
+            </w:r>
+          </w:p>
+        </w:tc>
+      </w:tr>
+      <w:tr>
+        <w:tc>
+          <w:tcPr>
+            <w:tcW w:type="dxa" w:w="3120"/>
+            <w:tcBorders>
+              <w:top w:val="single" w:color="CCCCCC" w:sz="1"/>
+              <w:left w:val="single" w:color="CCCCCC" w:sz="1"/>
+              <w:bottom w:val="single" w:color="CCCCCC" w:sz="1"/>
+              <w:right w:val="single" w:color="CCCCCC" w:sz="1"/>
+            </w:tcBorders>
+            <w:shd w:fill="F5F5F5" w:val="clear"/>
+            <w:tcMar>
+              <w:top w:type="dxa" w:w="80"/>
+              <w:left w:type="dxa" w:w="120"/>
+              <w:bottom w:type="dxa" w:w="80"/>
+              <w:right w:type="dxa" w:w="120"/>
+            </w:tcMar>
+            <w:vAlign w:val="center"/>
+          </w:tcPr>
+          <w:p>
+            <w:r>
+              <w:rPr>
+                <w:rFonts w:ascii="Arial" w:cs="Arial" w:eastAsia="Arial" w:hAnsi="Arial"/>
+                <w:b/>
+                <w:bCs/>
+                <w:color w:val="333333"/>
+                <w:sz w:val="20"/>
+                <w:szCs w:val="20"/>
+              </w:rPr>
+              <w:t xml:space="preserve">핵심 역할</w:t>
+            </w:r>
+          </w:p>
+        </w:tc>
+        <w:tc>
+          <w:tcPr>
+            <w:tcW w:type="dxa" w:w="3120"/>
+            <w:tcBorders>
+              <w:top w:val="single" w:color="CCCCCC" w:sz="1"/>
+              <w:left w:val="single" w:color="CCCCCC" w:sz="1"/>
+              <w:bottom w:val="single" w:color="CCCCCC" w:sz="1"/>
+              <w:right w:val="single" w:color="CCCCCC" w:sz="1"/>
+            </w:tcBorders>
+            <w:shd w:fill="FFFFFF" w:val="clear"/>
+            <w:tcMar>
+              <w:top w:type="dxa" w:w="80"/>
+              <w:left w:type="dxa" w:w="120"/>
+              <w:bottom w:type="dxa" w:w="80"/>
+              <w:right w:type="dxa" w:w="120"/>
+            </w:tcMar>
+            <w:vAlign w:val="center"/>
+          </w:tcPr>
+          <w:p>
+            <w:r>
+              <w:rPr>
+                <w:rFonts w:ascii="Arial" w:cs="Arial" w:eastAsia="Arial" w:hAnsi="Arial"/>
+                <w:b w:val="false"/>
+                <w:bCs w:val="false"/>
+                <w:color w:val="333333"/>
+                <w:sz w:val="20"/>
+                <w:szCs w:val="20"/>
+              </w:rPr>
+              <w:t xml:space="preserve">개발자</w:t>
+            </w:r>
+          </w:p>
+        </w:tc>
+        <w:tc>
+          <w:tcPr>
+            <w:tcW w:type="dxa" w:w="3120"/>
+            <w:tcBorders>
+              <w:top w:val="single" w:color="CCCCCC" w:sz="1"/>
+              <w:left w:val="single" w:color="CCCCCC" w:sz="1"/>
+              <w:bottom w:val="single" w:color="CCCCCC" w:sz="1"/>
+              <w:right w:val="single" w:color="CCCCCC" w:sz="1"/>
+            </w:tcBorders>
+            <w:shd w:fill="FFFFFF" w:val="clear"/>
+            <w:tcMar>
+              <w:top w:type="dxa" w:w="80"/>
+              <w:left w:type="dxa" w:w="120"/>
+              <w:bottom w:type="dxa" w:w="80"/>
+              <w:right w:type="dxa" w:w="120"/>
+            </w:tcMar>
+            <w:vAlign w:val="center"/>
+          </w:tcPr>
+          <w:p>
+            <w:r>
+              <w:rPr>
+                <w:rFonts w:ascii="Arial" w:cs="Arial" w:eastAsia="Arial" w:hAnsi="Arial"/>
+                <w:b w:val="false"/>
+                <w:bCs w:val="false"/>
+                <w:color w:val="333333"/>
+                <w:sz w:val="20"/>
+                <w:szCs w:val="20"/>
+              </w:rPr>
+              <w:t xml:space="preserve">의사결정자</w:t>
+            </w:r>
+          </w:p>
+        </w:tc>
+      </w:tr>
+    </w:tbl>
+    <w:p>
+      <w:r>
+        <w:br w:type="page"/>
+      </w:r>
+    </w:p>
+    <w:p>
+      <w:pPr>
+        <w:pStyle w:val="Heading1"/>
+      </w:pPr>
+      <w:r>
+        <w:rPr>
+          <w:rFonts w:ascii="Arial" w:cs="Arial" w:eastAsia="Arial" w:hAnsi="Arial"/>
+          <w:b/>
+          <w:bCs/>
+          <w:color w:val="003366"/>
+          <w:sz w:val="36"/>
+          <w:szCs w:val="36"/>
+        </w:rPr>
+        <w:t xml:space="preserve">9. 추진 일정</w:t>
       </w:r>
     </w:p>
     <w:p>
@@ -8959,7 +12484,7 @@
           <w:sz w:val="36"/>
           <w:szCs w:val="36"/>
         </w:rPr>
-        <w:t xml:space="preserve">9. 결론 및 승인 요청</w:t>
+        <w:t xml:space="preserve">10. 결론 및 승인 요청</w:t>
       </w:r>
     </w:p>
     <w:p>

</xml_diff>